<commit_message>
Made the final changes and completed the personal portfolio
</commit_message>
<xml_diff>
--- a/public/documents/Resume.docx
+++ b/public/documents/Resume.docx
@@ -236,612 +236,6 @@
           <w:sz w:val="23"/>
           <w:szCs w:val="23"/>
         </w:rPr>
-        <w:t>Education</w:t>
-      </w:r>
-    </w:p>
-    <w:p>
-      <w:pPr>
-        <w:spacing w:after="0" w:line="240" w:lineRule="auto"/>
-        <w:rPr>
-          <w:rFonts w:ascii="Arial" w:hAnsi="Arial" w:cs="Arial"/>
-          <w:b/>
-          <w:bCs/>
-          <w:sz w:val="23"/>
-          <w:szCs w:val="23"/>
-        </w:rPr>
-      </w:pPr>
-      <w:r>
-        <w:rPr>
-          <w:rFonts w:ascii="Arial" w:hAnsi="Arial" w:cs="Arial"/>
-          <w:b/>
-          <w:bCs/>
-          <w:sz w:val="23"/>
-          <w:szCs w:val="23"/>
-        </w:rPr>
-        <w:t>I.T Web Programming (Full-time Diploma)</w:t>
-      </w:r>
-    </w:p>
-    <w:p>
-      <w:pPr>
-        <w:tabs>
-          <w:tab w:val="right" w:pos="9360"/>
-        </w:tabs>
-        <w:spacing w:after="0" w:line="240" w:lineRule="auto"/>
-        <w:rPr>
-          <w:rFonts w:ascii="Arial" w:hAnsi="Arial" w:cs="Arial"/>
-        </w:rPr>
-      </w:pPr>
-      <w:r>
-        <w:rPr>
-          <w:rFonts w:ascii="Arial" w:hAnsi="Arial" w:cs="Arial"/>
-          <w:i/>
-          <w:iCs/>
-        </w:rPr>
-        <w:t>Nova Scotia Community College, Halifax, Canada</w:t>
-      </w:r>
-      <w:r>
-        <w:rPr>
-          <w:rFonts w:ascii="Arial" w:hAnsi="Arial" w:cs="Arial"/>
-        </w:rPr>
-        <w:tab/>
-        <w:t>Ongoing</w:t>
-      </w:r>
-    </w:p>
-    <w:p>
-      <w:pPr>
-        <w:tabs>
-          <w:tab w:val="right" w:pos="9360"/>
-        </w:tabs>
-        <w:spacing w:after="0" w:line="240" w:lineRule="auto"/>
-        <w:rPr>
-          <w:rFonts w:ascii="Arial" w:hAnsi="Arial" w:cs="Arial"/>
-        </w:rPr>
-      </w:pPr>
-      <w:r>
-        <w:rPr>
-          <w:rFonts w:ascii="Arial" w:hAnsi="Arial" w:cs="Arial"/>
-        </w:rPr>
-        <w:t>Expected Graduation: May 2026</w:t>
-      </w:r>
-    </w:p>
-    <w:p>
-      <w:pPr>
-        <w:tabs>
-          <w:tab w:val="right" w:pos="9360"/>
-        </w:tabs>
-        <w:spacing w:after="0" w:line="240" w:lineRule="auto"/>
-        <w:rPr>
-          <w:rFonts w:ascii="Arial" w:hAnsi="Arial" w:cs="Arial"/>
-        </w:rPr>
-      </w:pPr>
-    </w:p>
-    <w:p>
-      <w:pPr>
-        <w:tabs>
-          <w:tab w:val="right" w:pos="9360"/>
-        </w:tabs>
-        <w:spacing w:after="0" w:line="240" w:lineRule="auto"/>
-        <w:rPr>
-          <w:rFonts w:ascii="Arial" w:hAnsi="Arial" w:cs="Arial"/>
-          <w:i/>
-          <w:iCs/>
-          <w:lang w:val="en-CA"/>
-        </w:rPr>
-      </w:pPr>
-      <w:r>
-        <w:rPr>
-          <w:rFonts w:ascii="Arial" w:hAnsi="Arial" w:cs="Arial"/>
-          <w:b/>
-          <w:bCs/>
-          <w:lang w:val="en-CA"/>
-        </w:rPr>
-        <w:t>Business Administration</w:t>
-      </w:r>
-      <w:r>
-        <w:rPr>
-          <w:rFonts w:ascii="Arial" w:hAnsi="Arial" w:cs="Arial"/>
-          <w:b/>
-          <w:bCs/>
-          <w:lang w:val="en-CA"/>
-        </w:rPr>
-        <w:t xml:space="preserve"> (Full-time Master’s Degree)</w:t>
-      </w:r>
-      <w:r>
-        <w:rPr>
-          <w:rFonts w:ascii="Arial" w:hAnsi="Arial" w:cs="Arial"/>
-          <w:lang w:val="en-CA"/>
-        </w:rPr>
-        <w:br/>
-        <w:t>Guru Gobind Singh Indraprastha University – Delhi, India</w:t>
-      </w:r>
-      <w:r>
-        <w:rPr>
-          <w:rFonts w:ascii="Arial" w:hAnsi="Arial" w:cs="Arial"/>
-          <w:lang w:val="en-CA"/>
-        </w:rPr>
-        <w:t xml:space="preserve">                                   </w:t>
-      </w:r>
-      <w:r>
-        <w:rPr>
-          <w:rFonts w:ascii="Arial" w:hAnsi="Arial" w:cs="Arial"/>
-          <w:lang w:val="en-CA"/>
-        </w:rPr>
-        <w:t>Graduated: 2011</w:t>
-      </w:r>
-    </w:p>
-    <w:p>
-      <w:pPr>
-        <w:tabs>
-          <w:tab w:val="right" w:pos="9360"/>
-        </w:tabs>
-        <w:spacing w:after="0" w:line="240" w:lineRule="auto"/>
-        <w:rPr>
-          <w:rFonts w:ascii="Arial" w:hAnsi="Arial" w:cs="Arial"/>
-          <w:lang w:val="en-CA"/>
-        </w:rPr>
-      </w:pPr>
-    </w:p>
-    <w:p>
-      <w:pPr>
-        <w:tabs>
-          <w:tab w:val="right" w:pos="9360"/>
-        </w:tabs>
-        <w:spacing w:line="240" w:lineRule="auto"/>
-        <w:rPr>
-          <w:rFonts w:ascii="Arial" w:hAnsi="Arial" w:cs="Arial"/>
-          <w:lang w:val="en-CA"/>
-        </w:rPr>
-      </w:pPr>
-      <w:r>
-        <w:rPr>
-          <w:rFonts w:ascii="Arial" w:hAnsi="Arial" w:cs="Arial"/>
-          <w:b/>
-          <w:bCs/>
-          <w:lang w:val="en-CA"/>
-        </w:rPr>
-        <w:t>Commerce</w:t>
-      </w:r>
-      <w:r>
-        <w:rPr>
-          <w:rFonts w:ascii="Arial" w:hAnsi="Arial" w:cs="Arial"/>
-          <w:b/>
-          <w:bCs/>
-          <w:lang w:val="en-CA"/>
-        </w:rPr>
-        <w:t xml:space="preserve"> (Full-time Bachelor’s Degree)</w:t>
-      </w:r>
-      <w:r>
-        <w:rPr>
-          <w:rFonts w:ascii="Arial" w:hAnsi="Arial" w:cs="Arial"/>
-          <w:lang w:val="en-CA"/>
-        </w:rPr>
-        <w:br/>
-        <w:t>Delhi University – Delhi, India</w:t>
-      </w:r>
-      <w:r>
-        <w:rPr>
-          <w:rFonts w:ascii="Arial" w:hAnsi="Arial" w:cs="Arial"/>
-          <w:lang w:val="en-CA"/>
-        </w:rPr>
-        <w:t xml:space="preserve">                                                                               </w:t>
-      </w:r>
-      <w:r>
-        <w:rPr>
-          <w:rFonts w:ascii="Arial" w:hAnsi="Arial" w:cs="Arial"/>
-          <w:lang w:val="en-CA"/>
-        </w:rPr>
-        <w:t>Graduated: 2009</w:t>
-      </w:r>
-    </w:p>
-    <w:p>
-      <w:pPr>
-        <w:pBdr>
-          <w:top w:val="single" w:sz="4" w:space="0" w:color="auto"/>
-        </w:pBdr>
-        <w:shd w:val="clear" w:color="auto" w:fill="D9D9D9" w:themeFill="background1" w:themeFillShade="D9"/>
-        <w:spacing w:line="240" w:lineRule="auto"/>
-        <w:jc w:val="center"/>
-        <w:rPr>
-          <w:rFonts w:ascii="Arial" w:hAnsi="Arial" w:cs="Arial"/>
-          <w:b/>
-          <w:bCs/>
-          <w:smallCaps/>
-          <w:sz w:val="23"/>
-          <w:szCs w:val="23"/>
-        </w:rPr>
-      </w:pPr>
-      <w:r>
-        <w:rPr>
-          <w:rFonts w:ascii="Arial" w:hAnsi="Arial" w:cs="Arial"/>
-          <w:b/>
-          <w:bCs/>
-          <w:smallCaps/>
-          <w:sz w:val="23"/>
-          <w:szCs w:val="23"/>
-        </w:rPr>
-        <w:t>Certifications</w:t>
-      </w:r>
-    </w:p>
-    <w:p>
-      <w:pPr>
-        <w:spacing w:after="0" w:line="240" w:lineRule="auto"/>
-        <w:rPr>
-          <w:rFonts w:ascii="Arial" w:hAnsi="Arial" w:cs="Arial"/>
-          <w:i/>
-          <w:iCs/>
-          <w:lang w:val="en-CA"/>
-        </w:rPr>
-      </w:pPr>
-      <w:r>
-        <w:rPr>
-          <w:rFonts w:ascii="Arial" w:hAnsi="Arial" w:cs="Arial"/>
-          <w:b/>
-          <w:bCs/>
-          <w:lang w:val="en-CA"/>
-        </w:rPr>
-        <w:t>Cisco Certified Network Associate (C</w:t>
-      </w:r>
-      <w:r>
-        <w:rPr>
-          <w:rFonts w:ascii="Arial" w:hAnsi="Arial" w:cs="Arial"/>
-          <w:b/>
-          <w:bCs/>
-          <w:lang w:val="en-CA"/>
-        </w:rPr>
-        <w:t>.</w:t>
-      </w:r>
-      <w:r>
-        <w:rPr>
-          <w:rFonts w:ascii="Arial" w:hAnsi="Arial" w:cs="Arial"/>
-          <w:b/>
-          <w:bCs/>
-          <w:lang w:val="en-CA"/>
-        </w:rPr>
-        <w:t>C</w:t>
-      </w:r>
-      <w:r>
-        <w:rPr>
-          <w:rFonts w:ascii="Arial" w:hAnsi="Arial" w:cs="Arial"/>
-          <w:b/>
-          <w:bCs/>
-          <w:lang w:val="en-CA"/>
-        </w:rPr>
-        <w:t>.</w:t>
-      </w:r>
-      <w:r>
-        <w:rPr>
-          <w:rFonts w:ascii="Arial" w:hAnsi="Arial" w:cs="Arial"/>
-          <w:b/>
-          <w:bCs/>
-          <w:lang w:val="en-CA"/>
-        </w:rPr>
-        <w:t>N</w:t>
-      </w:r>
-      <w:r>
-        <w:rPr>
-          <w:rFonts w:ascii="Arial" w:hAnsi="Arial" w:cs="Arial"/>
-          <w:b/>
-          <w:bCs/>
-          <w:lang w:val="en-CA"/>
-        </w:rPr>
-        <w:t>.</w:t>
-      </w:r>
-      <w:r>
-        <w:rPr>
-          <w:rFonts w:ascii="Arial" w:hAnsi="Arial" w:cs="Arial"/>
-          <w:b/>
-          <w:bCs/>
-          <w:lang w:val="en-CA"/>
-        </w:rPr>
-        <w:t>A)</w:t>
-      </w:r>
-    </w:p>
-    <w:p>
-      <w:pPr>
-        <w:spacing w:line="240" w:lineRule="auto"/>
-        <w:rPr>
-          <w:rFonts w:ascii="Arial" w:hAnsi="Arial" w:cs="Arial"/>
-          <w:lang w:val="en-CA"/>
-        </w:rPr>
-      </w:pPr>
-      <w:r>
-        <w:rPr>
-          <w:rFonts w:ascii="Arial" w:hAnsi="Arial" w:cs="Arial"/>
-          <w:i/>
-          <w:iCs/>
-          <w:lang w:val="en-CA"/>
-        </w:rPr>
-        <w:t>Cisco Systems, Inc.</w:t>
-      </w:r>
-      <w:r>
-        <w:rPr>
-          <w:rFonts w:ascii="Arial" w:hAnsi="Arial" w:cs="Arial"/>
-          <w:i/>
-          <w:iCs/>
-          <w:lang w:val="en-CA"/>
-        </w:rPr>
-        <w:t>, Delhi, India</w:t>
-      </w:r>
-      <w:r>
-        <w:rPr>
-          <w:rFonts w:ascii="Arial" w:hAnsi="Arial" w:cs="Arial"/>
-          <w:i/>
-          <w:iCs/>
-          <w:lang w:val="en-CA"/>
-        </w:rPr>
-        <w:t xml:space="preserve">                                                      </w:t>
-      </w:r>
-      <w:r>
-        <w:rPr>
-          <w:rFonts w:ascii="Arial" w:hAnsi="Arial" w:cs="Arial"/>
-          <w:lang w:val="en-CA"/>
-        </w:rPr>
-        <w:t xml:space="preserve">February 2020 </w:t>
-      </w:r>
-      <w:r>
-        <w:rPr>
-          <w:rFonts w:ascii="Arial" w:hAnsi="Arial" w:cs="Arial"/>
-          <w:lang w:val="en-CA"/>
-        </w:rPr>
-        <w:t>-</w:t>
-      </w:r>
-      <w:r>
-        <w:rPr>
-          <w:rFonts w:ascii="Arial" w:hAnsi="Arial" w:cs="Arial"/>
-          <w:lang w:val="en-CA"/>
-        </w:rPr>
-        <w:t xml:space="preserve"> August 2028</w:t>
-      </w:r>
-    </w:p>
-    <w:p>
-      <w:pPr>
-        <w:spacing w:line="240" w:lineRule="auto"/>
-        <w:rPr>
-          <w:rFonts w:ascii="Arial" w:hAnsi="Arial" w:cs="Arial"/>
-          <w:lang w:val="en-CA"/>
-        </w:rPr>
-      </w:pPr>
-      <w:r>
-        <w:rPr>
-          <w:rFonts w:ascii="Arial" w:hAnsi="Arial" w:cs="Arial"/>
-          <w:b/>
-          <w:bCs/>
-          <w:lang w:val="en-CA"/>
-        </w:rPr>
-        <w:t>Jetking Certified Hardware &amp; Networking Professional (Cloud)</w:t>
-      </w:r>
-      <w:r>
-        <w:rPr>
-          <w:rFonts w:ascii="Arial" w:hAnsi="Arial" w:cs="Arial"/>
-          <w:lang w:val="en-CA"/>
-        </w:rPr>
-        <w:br/>
-      </w:r>
-      <w:r>
-        <w:rPr>
-          <w:rFonts w:ascii="Arial" w:hAnsi="Arial" w:cs="Arial"/>
-          <w:i/>
-          <w:iCs/>
-          <w:lang w:val="en-CA"/>
-        </w:rPr>
-        <w:t>Jetking Infotrain Ltd.</w:t>
-      </w:r>
-      <w:r>
-        <w:rPr>
-          <w:rFonts w:ascii="Arial" w:hAnsi="Arial" w:cs="Arial"/>
-          <w:i/>
-          <w:iCs/>
-          <w:lang w:val="en-CA"/>
-        </w:rPr>
-        <w:t>, Delhi, India</w:t>
-      </w:r>
-      <w:r>
-        <w:rPr>
-          <w:rFonts w:ascii="Arial" w:hAnsi="Arial" w:cs="Arial"/>
-          <w:i/>
-          <w:iCs/>
-          <w:lang w:val="en-CA"/>
-        </w:rPr>
-        <w:t xml:space="preserve">                                                              </w:t>
-      </w:r>
-      <w:r>
-        <w:rPr>
-          <w:rFonts w:ascii="Arial" w:hAnsi="Arial" w:cs="Arial"/>
-          <w:lang w:val="en-CA"/>
-        </w:rPr>
-        <w:t>Completed</w:t>
-      </w:r>
-      <w:r>
-        <w:rPr>
-          <w:rFonts w:ascii="Arial" w:hAnsi="Arial" w:cs="Arial"/>
-          <w:lang w:val="en-CA"/>
-        </w:rPr>
-        <w:t>:</w:t>
-      </w:r>
-      <w:r>
-        <w:rPr>
-          <w:rFonts w:ascii="Arial" w:hAnsi="Arial" w:cs="Arial"/>
-          <w:lang w:val="en-CA"/>
-        </w:rPr>
-        <w:t xml:space="preserve"> March 2014</w:t>
-      </w:r>
-    </w:p>
-    <w:p>
-      <w:pPr>
-        <w:pBdr>
-          <w:top w:val="single" w:sz="4" w:space="0" w:color="auto"/>
-        </w:pBdr>
-        <w:shd w:val="clear" w:color="auto" w:fill="D9D9D9" w:themeFill="background1" w:themeFillShade="D9"/>
-        <w:spacing w:line="240" w:lineRule="auto"/>
-        <w:jc w:val="center"/>
-        <w:rPr>
-          <w:rFonts w:ascii="Arial" w:hAnsi="Arial" w:cs="Arial"/>
-          <w:b/>
-          <w:bCs/>
-          <w:smallCaps/>
-          <w:sz w:val="23"/>
-          <w:szCs w:val="23"/>
-        </w:rPr>
-      </w:pPr>
-      <w:r>
-        <w:rPr>
-          <w:rFonts w:ascii="Arial" w:hAnsi="Arial" w:cs="Arial"/>
-          <w:b/>
-          <w:bCs/>
-          <w:smallCaps/>
-          <w:sz w:val="23"/>
-          <w:szCs w:val="23"/>
-        </w:rPr>
-        <w:t xml:space="preserve">Brief </w:t>
-      </w:r>
-      <w:r>
-        <w:rPr>
-          <w:rFonts w:ascii="Arial" w:hAnsi="Arial" w:cs="Arial"/>
-          <w:b/>
-          <w:bCs/>
-          <w:smallCaps/>
-          <w:sz w:val="23"/>
-          <w:szCs w:val="23"/>
-        </w:rPr>
-        <w:t>Project</w:t>
-      </w:r>
-      <w:r>
-        <w:rPr>
-          <w:rFonts w:ascii="Arial" w:hAnsi="Arial" w:cs="Arial"/>
-          <w:b/>
-          <w:bCs/>
-          <w:smallCaps/>
-          <w:sz w:val="23"/>
-          <w:szCs w:val="23"/>
-        </w:rPr>
-        <w:t xml:space="preserve"> Contributions</w:t>
-      </w:r>
-    </w:p>
-    <w:p>
-      <w:pPr>
-        <w:pStyle w:val="ListParagraph"/>
-        <w:numPr>
-          <w:ilvl w:val="0"/>
-          <w:numId w:val="5"/>
-        </w:numPr>
-        <w:spacing w:after="0" w:line="240" w:lineRule="auto"/>
-        <w:rPr>
-          <w:rFonts w:ascii="Arial" w:hAnsi="Arial" w:cs="Arial"/>
-        </w:rPr>
-      </w:pPr>
-      <w:r>
-        <w:rPr>
-          <w:rFonts w:ascii="Arial" w:hAnsi="Arial" w:cs="Arial"/>
-          <w:b/>
-          <w:bCs/>
-        </w:rPr>
-        <w:t>WaitWell:</w:t>
-      </w:r>
-      <w:r>
-        <w:rPr>
-          <w:rFonts w:ascii="Arial" w:hAnsi="Arial" w:cs="Arial"/>
-        </w:rPr>
-        <w:t xml:space="preserve"> </w:t>
-      </w:r>
-      <w:r>
-        <w:rPr>
-          <w:rFonts w:ascii="Arial" w:hAnsi="Arial" w:cs="Arial"/>
-        </w:rPr>
-        <w:t>I contributed to this project as a maintainer and developer collaborating with team members on the project's development to ensure code quality.</w:t>
-      </w:r>
-    </w:p>
-    <w:p>
-      <w:pPr>
-        <w:pStyle w:val="ListParagraph"/>
-        <w:numPr>
-          <w:ilvl w:val="0"/>
-          <w:numId w:val="3"/>
-        </w:numPr>
-        <w:spacing w:line="240" w:lineRule="auto"/>
-        <w:rPr>
-          <w:rFonts w:ascii="Arial" w:hAnsi="Arial" w:cs="Arial"/>
-          <w:b/>
-          <w:bCs/>
-        </w:rPr>
-      </w:pPr>
-      <w:r>
-        <w:rPr>
-          <w:rFonts w:ascii="Arial" w:hAnsi="Arial" w:cs="Arial"/>
-          <w:b/>
-          <w:bCs/>
-        </w:rPr>
-        <w:t>Playing video games:</w:t>
-      </w:r>
-      <w:r>
-        <w:rPr>
-          <w:rFonts w:ascii="Arial" w:hAnsi="Arial" w:cs="Arial"/>
-        </w:rPr>
-        <w:t xml:space="preserve"> Enjoy strategy and problem-solving games that encourage critical thinking, pattern recognition and persistence.</w:t>
-      </w:r>
-    </w:p>
-    <w:p>
-      <w:pPr>
-        <w:pStyle w:val="ListParagraph"/>
-        <w:numPr>
-          <w:ilvl w:val="0"/>
-          <w:numId w:val="3"/>
-        </w:numPr>
-        <w:spacing w:line="240" w:lineRule="auto"/>
-        <w:rPr>
-          <w:rFonts w:ascii="Arial" w:hAnsi="Arial" w:cs="Arial"/>
-          <w:b/>
-          <w:bCs/>
-        </w:rPr>
-      </w:pPr>
-      <w:r>
-        <w:rPr>
-          <w:rFonts w:ascii="Arial" w:hAnsi="Arial" w:cs="Arial"/>
-          <w:b/>
-          <w:bCs/>
-        </w:rPr>
-        <w:t xml:space="preserve">Student Progress Dashboard: </w:t>
-      </w:r>
-      <w:r>
-        <w:rPr>
-          <w:rFonts w:ascii="Arial" w:hAnsi="Arial" w:cs="Arial"/>
-          <w:bCs/>
-        </w:rPr>
-        <w:t xml:space="preserve">I </w:t>
-      </w:r>
-      <w:r>
-        <w:rPr>
-          <w:rFonts w:ascii="Arial" w:hAnsi="Arial" w:cs="Arial"/>
-          <w:bCs/>
-        </w:rPr>
-        <w:t>mainly worked as a front-end developer on this project, collaborating with the team to design and implement the user interface and experience of the web application using React and Tailwind CSS.</w:t>
-      </w:r>
-    </w:p>
-    <w:p>
-      <w:pPr>
-        <w:pBdr>
-          <w:top w:val="single" w:sz="4" w:space="0" w:color="auto"/>
-        </w:pBdr>
-        <w:shd w:val="clear" w:color="auto" w:fill="D9D9D9" w:themeFill="background1" w:themeFillShade="D9"/>
-        <w:spacing w:line="240" w:lineRule="auto"/>
-        <w:jc w:val="center"/>
-        <w:rPr>
-          <w:rFonts w:ascii="Arial" w:hAnsi="Arial" w:cs="Arial"/>
-          <w:b/>
-          <w:bCs/>
-          <w:smallCaps/>
-          <w:sz w:val="23"/>
-          <w:szCs w:val="23"/>
-        </w:rPr>
-      </w:pPr>
-      <w:r>
-        <w:rPr>
-          <w:rFonts w:ascii="Arial" w:hAnsi="Arial" w:cs="Arial"/>
-          <w:b/>
-          <w:bCs/>
-          <w:smallCaps/>
-          <w:sz w:val="23"/>
-          <w:szCs w:val="23"/>
-        </w:rPr>
         <w:t>Soft Skills</w:t>
       </w:r>
     </w:p>
@@ -862,6 +256,7 @@
         <w:sectPr>
           <w:headerReference w:type="default" r:id="rId10"/>
           <w:headerReference w:type="first" r:id="rId11"/>
+          <w:type w:val="continuous"/>
           <w:pgSz w:w="12240" w:h="15840"/>
           <w:pgMar w:top="-286" w:right="1440" w:bottom="1170" w:left="1440" w:header="0" w:footer="708" w:gutter="0"/>
           <w:cols w:space="708"/>
@@ -1452,7 +847,6 @@
           <w:b/>
           <w:bCs/>
         </w:rPr>
-        <w:lastRenderedPageBreak/>
         <w:t xml:space="preserve">Frameworks/Tools: </w:t>
       </w:r>
       <w:r>
@@ -1701,14 +1095,1041 @@
     </w:p>
     <w:p>
       <w:pPr>
-        <w:spacing w:before="240" w:line="240" w:lineRule="auto"/>
-        <w:jc w:val="both"/>
-        <w:rPr>
-          <w:rFonts w:ascii="Arial" w:hAnsi="Arial" w:cs="Arial"/>
+        <w:pBdr>
+          <w:top w:val="single" w:sz="4" w:space="0" w:color="auto"/>
+        </w:pBdr>
+        <w:shd w:val="clear" w:color="auto" w:fill="D9D9D9" w:themeFill="background1" w:themeFillShade="D9"/>
+        <w:spacing w:line="240" w:lineRule="auto"/>
+        <w:jc w:val="center"/>
+        <w:rPr>
+          <w:rFonts w:ascii="Arial" w:hAnsi="Arial" w:cs="Arial"/>
+          <w:b/>
+          <w:bCs/>
+          <w:smallCaps/>
           <w:sz w:val="23"/>
           <w:szCs w:val="23"/>
         </w:rPr>
+      </w:pPr>
+      <w:r>
+        <w:rPr>
+          <w:rFonts w:ascii="Arial" w:hAnsi="Arial" w:cs="Arial"/>
+          <w:b/>
+          <w:bCs/>
+          <w:smallCaps/>
+          <w:sz w:val="23"/>
+          <w:szCs w:val="23"/>
+        </w:rPr>
+        <w:t>Project Contributions</w:t>
+      </w:r>
+    </w:p>
+    <w:p>
+      <w:pPr>
+        <w:spacing w:after="0" w:line="240" w:lineRule="auto"/>
+        <w:rPr>
+          <w:rFonts w:ascii="Arial" w:hAnsi="Arial" w:cs="Arial"/>
+          <w:b/>
+          <w:bCs/>
+        </w:rPr>
+      </w:pPr>
+      <w:r>
+        <w:rPr>
+          <w:rFonts w:ascii="Arial" w:hAnsi="Arial" w:cs="Arial"/>
+          <w:b/>
+          <w:bCs/>
+        </w:rPr>
+        <w:t>WaitWell -</w:t>
+      </w:r>
+      <w:r>
+        <w:rPr>
+          <w:rFonts w:ascii="Arial" w:hAnsi="Arial" w:cs="Arial"/>
+          <w:b/>
+          <w:bCs/>
+        </w:rPr>
+        <w:t xml:space="preserve"> Patient Visit Tracke</w:t>
+      </w:r>
+      <w:r>
+        <w:rPr>
+          <w:rFonts w:ascii="Arial" w:hAnsi="Arial" w:cs="Arial"/>
+          <w:b/>
+          <w:bCs/>
+        </w:rPr>
+        <w:t>r</w:t>
+      </w:r>
+    </w:p>
+    <w:p>
+      <w:pPr>
+        <w:spacing w:after="0" w:line="240" w:lineRule="auto"/>
+        <w:rPr>
+          <w:rFonts w:ascii="Arial" w:hAnsi="Arial" w:cs="Arial"/>
+          <w:bCs/>
+        </w:rPr>
+      </w:pPr>
+      <w:r>
+        <w:rPr>
+          <w:rFonts w:ascii="Arial" w:hAnsi="Arial" w:cs="Arial"/>
+          <w:bCs/>
+        </w:rPr>
+        <w:t>Maintainer &amp; Developer</w:t>
+      </w:r>
+    </w:p>
+    <w:p>
+      <w:pPr>
+        <w:pStyle w:val="ListParagraph"/>
+        <w:numPr>
+          <w:ilvl w:val="0"/>
+          <w:numId w:val="7"/>
+        </w:numPr>
+        <w:spacing w:line="240" w:lineRule="auto"/>
+        <w:rPr>
+          <w:rFonts w:ascii="Arial" w:hAnsi="Arial" w:cs="Arial"/>
+          <w:bCs/>
+        </w:rPr>
+      </w:pPr>
+      <w:r>
+        <w:rPr>
+          <w:rFonts w:ascii="Arial" w:hAnsi="Arial" w:cs="Arial"/>
+          <w:bCs/>
+        </w:rPr>
+        <w:t>Built a web application that provides real-time visibility into patient visit progress,</w:t>
+      </w:r>
+      <w:r>
+        <w:rPr>
+          <w:rFonts w:ascii="Arial" w:hAnsi="Arial" w:cs="Arial"/>
+          <w:bCs/>
+        </w:rPr>
+        <w:t xml:space="preserve"> thus, </w:t>
+      </w:r>
+      <w:r>
+        <w:rPr>
+          <w:rFonts w:ascii="Arial" w:hAnsi="Arial" w:cs="Arial"/>
+          <w:bCs/>
+        </w:rPr>
+        <w:t>reducing uncertainty during wait times</w:t>
+      </w:r>
+      <w:r>
+        <w:rPr>
+          <w:rFonts w:ascii="Arial" w:hAnsi="Arial" w:cs="Arial"/>
+          <w:bCs/>
+        </w:rPr>
+        <w:t>.</w:t>
+      </w:r>
+    </w:p>
+    <w:p>
+      <w:pPr>
+        <w:pStyle w:val="ListParagraph"/>
+        <w:numPr>
+          <w:ilvl w:val="0"/>
+          <w:numId w:val="7"/>
+        </w:numPr>
+        <w:spacing w:line="240" w:lineRule="auto"/>
+        <w:rPr>
+          <w:rFonts w:ascii="Arial" w:hAnsi="Arial" w:cs="Arial"/>
+          <w:bCs/>
+        </w:rPr>
+      </w:pPr>
+      <w:r>
+        <w:rPr>
+          <w:rFonts w:ascii="Arial" w:hAnsi="Arial" w:cs="Arial"/>
+          <w:bCs/>
+        </w:rPr>
+        <w:t>Improved user experience in healthcare settings by addressing lack of communication during patient visits</w:t>
+      </w:r>
+      <w:r>
+        <w:rPr>
+          <w:rFonts w:ascii="Arial" w:hAnsi="Arial" w:cs="Arial"/>
+          <w:bCs/>
+        </w:rPr>
+        <w:t>.</w:t>
+      </w:r>
+    </w:p>
+    <w:p>
+      <w:pPr>
+        <w:pStyle w:val="ListParagraph"/>
+        <w:numPr>
+          <w:ilvl w:val="0"/>
+          <w:numId w:val="7"/>
+        </w:numPr>
+        <w:spacing w:line="240" w:lineRule="auto"/>
+        <w:rPr>
+          <w:rFonts w:ascii="Arial" w:hAnsi="Arial" w:cs="Arial"/>
+          <w:bCs/>
+        </w:rPr>
+      </w:pPr>
+      <w:r>
+        <w:rPr>
+          <w:rFonts w:ascii="Arial" w:hAnsi="Arial" w:cs="Arial"/>
+          <w:bCs/>
+        </w:rPr>
+        <w:t>Ensured privacy-first design by avoiding exposure of sensitive medical or personal data</w:t>
+      </w:r>
+      <w:r>
+        <w:rPr>
+          <w:rFonts w:ascii="Arial" w:hAnsi="Arial" w:cs="Arial"/>
+          <w:bCs/>
+        </w:rPr>
+        <w:t>.</w:t>
+      </w:r>
+    </w:p>
+    <w:p>
+      <w:pPr>
+        <w:pStyle w:val="ListParagraph"/>
+        <w:numPr>
+          <w:ilvl w:val="0"/>
+          <w:numId w:val="7"/>
+        </w:numPr>
+        <w:spacing w:line="240" w:lineRule="auto"/>
+        <w:rPr>
+          <w:rFonts w:ascii="Arial" w:hAnsi="Arial" w:cs="Arial"/>
+          <w:bCs/>
+        </w:rPr>
+      </w:pPr>
+      <w:r>
+        <w:rPr>
+          <w:rFonts w:ascii="Arial" w:hAnsi="Arial" w:cs="Arial"/>
+          <w:bCs/>
+        </w:rPr>
+        <w:t>Collaborated in a team environment to maintain code quality and support scalable development</w:t>
+      </w:r>
+      <w:r>
+        <w:rPr>
+          <w:rFonts w:ascii="Arial" w:hAnsi="Arial" w:cs="Arial"/>
+          <w:bCs/>
+        </w:rPr>
+        <w:t>.</w:t>
+      </w:r>
+    </w:p>
+    <w:p>
+      <w:pPr>
+        <w:pStyle w:val="ListParagraph"/>
+        <w:numPr>
+          <w:ilvl w:val="0"/>
+          <w:numId w:val="7"/>
+        </w:numPr>
+        <w:spacing w:line="240" w:lineRule="auto"/>
+        <w:rPr>
+          <w:rFonts w:ascii="Arial" w:hAnsi="Arial" w:cs="Arial"/>
+        </w:rPr>
+      </w:pPr>
+      <w:r>
+        <w:rPr>
+          <w:rFonts w:ascii="Arial" w:hAnsi="Arial" w:cs="Arial"/>
+          <w:bCs/>
+        </w:rPr>
+        <w:t>Contributed to a solution with potential to reduce staff workload from repeated patient inquiries</w:t>
+      </w:r>
+      <w:r>
+        <w:rPr>
+          <w:rFonts w:ascii="Arial" w:hAnsi="Arial" w:cs="Arial"/>
+          <w:bCs/>
+        </w:rPr>
+        <w:t>.</w:t>
+      </w:r>
+      <w:r>
+        <w:rPr>
+          <w:rFonts w:ascii="Arial" w:hAnsi="Arial" w:cs="Arial"/>
+        </w:rPr>
+        <w:t xml:space="preserve"> </w:t>
+      </w:r>
+    </w:p>
+    <w:p>
+      <w:pPr>
+        <w:spacing w:after="0" w:line="240" w:lineRule="auto"/>
+        <w:rPr>
+          <w:rFonts w:ascii="Arial" w:hAnsi="Arial" w:cs="Arial"/>
+          <w:b/>
+        </w:rPr>
+      </w:pPr>
+      <w:r>
+        <w:rPr>
+          <w:rFonts w:ascii="Arial" w:hAnsi="Arial" w:cs="Arial"/>
+          <w:b/>
+        </w:rPr>
+        <w:t>N</w:t>
+      </w:r>
+      <w:r>
+        <w:rPr>
+          <w:rFonts w:ascii="Arial" w:hAnsi="Arial" w:cs="Arial"/>
+          <w:b/>
+        </w:rPr>
+        <w:t>.</w:t>
+      </w:r>
+      <w:r>
+        <w:rPr>
+          <w:rFonts w:ascii="Arial" w:hAnsi="Arial" w:cs="Arial"/>
+          <w:b/>
+        </w:rPr>
+        <w:t>S</w:t>
+      </w:r>
+      <w:r>
+        <w:rPr>
+          <w:rFonts w:ascii="Arial" w:hAnsi="Arial" w:cs="Arial"/>
+          <w:b/>
+        </w:rPr>
+        <w:t>.</w:t>
+      </w:r>
+      <w:r>
+        <w:rPr>
+          <w:rFonts w:ascii="Arial" w:hAnsi="Arial" w:cs="Arial"/>
+          <w:b/>
+        </w:rPr>
+        <w:t>C</w:t>
+      </w:r>
+      <w:r>
+        <w:rPr>
+          <w:rFonts w:ascii="Arial" w:hAnsi="Arial" w:cs="Arial"/>
+          <w:b/>
+        </w:rPr>
+        <w:t>.C Skillpath - Student Learning Platform (</w:t>
+      </w:r>
+      <w:r>
+        <w:rPr>
+          <w:rFonts w:ascii="Arial" w:hAnsi="Arial" w:cs="Arial"/>
+          <w:b/>
+        </w:rPr>
+        <w:t>Hackathon 2026</w:t>
+      </w:r>
+      <w:r>
+        <w:rPr>
+          <w:rFonts w:ascii="Arial" w:hAnsi="Arial" w:cs="Arial"/>
+          <w:b/>
+        </w:rPr>
+        <w:t>)</w:t>
+      </w:r>
+    </w:p>
+    <w:p>
+      <w:pPr>
+        <w:spacing w:after="0" w:line="240" w:lineRule="auto"/>
+        <w:rPr>
+          <w:rFonts w:ascii="Arial" w:hAnsi="Arial" w:cs="Arial"/>
+        </w:rPr>
+      </w:pPr>
+      <w:r>
+        <w:rPr>
+          <w:rFonts w:ascii="Arial" w:hAnsi="Arial" w:cs="Arial"/>
+        </w:rPr>
+        <w:t>Documentation &amp; Presentation Contributor</w:t>
+      </w:r>
+    </w:p>
+    <w:p>
+      <w:pPr>
+        <w:pStyle w:val="ListParagraph"/>
+        <w:numPr>
+          <w:ilvl w:val="0"/>
+          <w:numId w:val="8"/>
+        </w:numPr>
+        <w:spacing w:line="240" w:lineRule="auto"/>
+        <w:rPr>
+          <w:rFonts w:ascii="Arial" w:hAnsi="Arial" w:cs="Arial"/>
+        </w:rPr>
+      </w:pPr>
+      <w:r>
+        <w:rPr>
+          <w:rFonts w:ascii="Arial" w:hAnsi="Arial" w:cs="Arial"/>
+        </w:rPr>
+        <w:t>Supported development of a peer-learning platform enabling students to exchange knowledge and earn rewards</w:t>
+      </w:r>
+      <w:r>
+        <w:rPr>
+          <w:rFonts w:ascii="Arial" w:hAnsi="Arial" w:cs="Arial"/>
+        </w:rPr>
+        <w:t>.</w:t>
+      </w:r>
+    </w:p>
+    <w:p>
+      <w:pPr>
+        <w:pStyle w:val="ListParagraph"/>
+        <w:numPr>
+          <w:ilvl w:val="0"/>
+          <w:numId w:val="8"/>
+        </w:numPr>
+        <w:spacing w:line="240" w:lineRule="auto"/>
+        <w:rPr>
+          <w:rFonts w:ascii="Arial" w:hAnsi="Arial" w:cs="Arial"/>
+        </w:rPr>
+      </w:pPr>
+      <w:r>
+        <w:rPr>
+          <w:rFonts w:ascii="Arial" w:hAnsi="Arial" w:cs="Arial"/>
+        </w:rPr>
+        <w:t xml:space="preserve">Produced clear project documentation, including </w:t>
+      </w:r>
+      <w:r>
+        <w:rPr>
+          <w:rFonts w:ascii="Arial" w:hAnsi="Arial" w:cs="Arial"/>
+        </w:rPr>
+        <w:t>system concept, workflow</w:t>
+      </w:r>
+      <w:r>
+        <w:rPr>
+          <w:rFonts w:ascii="Arial" w:hAnsi="Arial" w:cs="Arial"/>
+        </w:rPr>
+        <w:t xml:space="preserve"> and user experience design</w:t>
+      </w:r>
+      <w:r>
+        <w:rPr>
+          <w:rFonts w:ascii="Arial" w:hAnsi="Arial" w:cs="Arial"/>
+        </w:rPr>
+        <w:t>.</w:t>
+      </w:r>
+    </w:p>
+    <w:p>
+      <w:pPr>
+        <w:pStyle w:val="ListParagraph"/>
+        <w:numPr>
+          <w:ilvl w:val="0"/>
+          <w:numId w:val="8"/>
+        </w:numPr>
+        <w:spacing w:line="240" w:lineRule="auto"/>
+        <w:rPr>
+          <w:rFonts w:ascii="Arial" w:hAnsi="Arial" w:cs="Arial"/>
+        </w:rPr>
+      </w:pPr>
+      <w:r>
+        <w:rPr>
+          <w:rFonts w:ascii="Arial" w:hAnsi="Arial" w:cs="Arial"/>
+        </w:rPr>
+        <w:t>Designed presentation materials to effectively communicate the solution to judges and stakeholders</w:t>
+      </w:r>
+      <w:r>
+        <w:rPr>
+          <w:rFonts w:ascii="Arial" w:hAnsi="Arial" w:cs="Arial"/>
+        </w:rPr>
+        <w:t>.</w:t>
+      </w:r>
+    </w:p>
+    <w:p>
+      <w:pPr>
+        <w:pStyle w:val="ListParagraph"/>
+        <w:numPr>
+          <w:ilvl w:val="0"/>
+          <w:numId w:val="8"/>
+        </w:numPr>
+        <w:spacing w:line="240" w:lineRule="auto"/>
+        <w:rPr>
+          <w:rFonts w:ascii="Arial" w:hAnsi="Arial" w:cs="Arial"/>
+          <w:b/>
+          <w:bCs/>
+        </w:rPr>
+      </w:pPr>
+      <w:r>
+        <w:rPr>
+          <w:rFonts w:ascii="Arial" w:hAnsi="Arial" w:cs="Arial"/>
+        </w:rPr>
+        <w:lastRenderedPageBreak/>
+        <w:t>Focused on addressing gaps in accessible academic support and collaborative learning</w:t>
+      </w:r>
+      <w:r>
+        <w:rPr>
+          <w:rFonts w:ascii="Arial" w:hAnsi="Arial" w:cs="Arial"/>
+        </w:rPr>
+        <w:t>.</w:t>
+      </w:r>
+    </w:p>
+    <w:p>
+      <w:pPr>
+        <w:spacing w:after="0" w:line="240" w:lineRule="auto"/>
+        <w:rPr>
+          <w:rFonts w:ascii="Arial" w:hAnsi="Arial" w:cs="Arial"/>
+          <w:b/>
+        </w:rPr>
+      </w:pPr>
+      <w:r>
+        <w:rPr>
+          <w:rFonts w:ascii="Arial" w:hAnsi="Arial" w:cs="Arial"/>
+          <w:b/>
+        </w:rPr>
+        <w:t>Student Progress Das</w:t>
+      </w:r>
+      <w:r>
+        <w:rPr>
+          <w:rFonts w:ascii="Arial" w:hAnsi="Arial" w:cs="Arial"/>
+          <w:b/>
+        </w:rPr>
+        <w:t>hboard (</w:t>
+      </w:r>
+      <w:r>
+        <w:rPr>
+          <w:rFonts w:ascii="Arial" w:hAnsi="Arial" w:cs="Arial"/>
+          <w:b/>
+        </w:rPr>
+        <w:t>Summer Work Term Project</w:t>
+      </w:r>
+      <w:r>
+        <w:rPr>
+          <w:rFonts w:ascii="Arial" w:hAnsi="Arial" w:cs="Arial"/>
+          <w:b/>
+        </w:rPr>
+        <w:t xml:space="preserve"> 2025)</w:t>
+      </w:r>
+    </w:p>
+    <w:p>
+      <w:pPr>
+        <w:spacing w:after="0" w:line="240" w:lineRule="auto"/>
+        <w:rPr>
+          <w:rFonts w:ascii="Arial" w:hAnsi="Arial" w:cs="Arial"/>
+        </w:rPr>
+      </w:pPr>
+      <w:r>
+        <w:rPr>
+          <w:rFonts w:ascii="Arial" w:hAnsi="Arial" w:cs="Arial"/>
+        </w:rPr>
+        <w:t>Front-End Developer</w:t>
+      </w:r>
+    </w:p>
+    <w:p>
+      <w:pPr>
+        <w:pStyle w:val="ListParagraph"/>
+        <w:numPr>
+          <w:ilvl w:val="0"/>
+          <w:numId w:val="9"/>
+        </w:numPr>
+        <w:spacing w:line="240" w:lineRule="auto"/>
+        <w:rPr>
+          <w:rFonts w:ascii="Arial" w:hAnsi="Arial" w:cs="Arial"/>
+        </w:rPr>
+      </w:pPr>
+      <w:r>
+        <w:rPr>
+          <w:rFonts w:ascii="Arial" w:hAnsi="Arial" w:cs="Arial"/>
+        </w:rPr>
+        <w:t>Designed and implemented a responsive front-end using React and Tailwind CSS for a student analytics dashboard</w:t>
+      </w:r>
+      <w:r>
+        <w:rPr>
+          <w:rFonts w:ascii="Arial" w:hAnsi="Arial" w:cs="Arial"/>
+        </w:rPr>
+        <w:t>.</w:t>
+      </w:r>
+    </w:p>
+    <w:p>
+      <w:pPr>
+        <w:pStyle w:val="ListParagraph"/>
+        <w:numPr>
+          <w:ilvl w:val="0"/>
+          <w:numId w:val="9"/>
+        </w:numPr>
+        <w:spacing w:line="240" w:lineRule="auto"/>
+        <w:rPr>
+          <w:rFonts w:ascii="Arial" w:hAnsi="Arial" w:cs="Arial"/>
+        </w:rPr>
+      </w:pPr>
+      <w:r>
+        <w:rPr>
+          <w:rFonts w:ascii="Arial" w:hAnsi="Arial" w:cs="Arial"/>
+        </w:rPr>
+        <w:t>Enabled instructors to upload and v</w:t>
+      </w:r>
+      <w:r>
+        <w:rPr>
+          <w:rFonts w:ascii="Arial" w:hAnsi="Arial" w:cs="Arial"/>
+        </w:rPr>
+        <w:t>isualize CSV-based data (grades and</w:t>
+      </w:r>
+      <w:r>
+        <w:rPr>
+          <w:rFonts w:ascii="Arial" w:hAnsi="Arial" w:cs="Arial"/>
+        </w:rPr>
+        <w:t xml:space="preserve"> attendance) through structured dashboards and tables</w:t>
+      </w:r>
+      <w:r>
+        <w:rPr>
+          <w:rFonts w:ascii="Arial" w:hAnsi="Arial" w:cs="Arial"/>
+        </w:rPr>
+        <w:t>.</w:t>
+      </w:r>
+    </w:p>
+    <w:p>
+      <w:pPr>
+        <w:pStyle w:val="ListParagraph"/>
+        <w:numPr>
+          <w:ilvl w:val="0"/>
+          <w:numId w:val="9"/>
+        </w:numPr>
+        <w:spacing w:line="240" w:lineRule="auto"/>
+        <w:rPr>
+          <w:rFonts w:ascii="Arial" w:hAnsi="Arial" w:cs="Arial"/>
+        </w:rPr>
+      </w:pPr>
+      <w:r>
+        <w:rPr>
+          <w:rFonts w:ascii="Arial" w:hAnsi="Arial" w:cs="Arial"/>
+        </w:rPr>
+        <w:t>Enhanced user experience by simplifying complex academic data into clear, actionable insights</w:t>
+      </w:r>
+      <w:r>
+        <w:rPr>
+          <w:rFonts w:ascii="Arial" w:hAnsi="Arial" w:cs="Arial"/>
+        </w:rPr>
+        <w:t>.</w:t>
+      </w:r>
+    </w:p>
+    <w:p>
+      <w:pPr>
+        <w:pStyle w:val="ListParagraph"/>
+        <w:numPr>
+          <w:ilvl w:val="0"/>
+          <w:numId w:val="9"/>
+        </w:numPr>
+        <w:spacing w:line="240" w:lineRule="auto"/>
+        <w:rPr>
+          <w:rFonts w:ascii="Arial" w:hAnsi="Arial" w:cs="Arial"/>
+        </w:rPr>
+      </w:pPr>
+      <w:r>
+        <w:rPr>
+          <w:rFonts w:ascii="Arial" w:hAnsi="Arial" w:cs="Arial"/>
+        </w:rPr>
+        <w:t>Collaborated in a team environment to align UI/UX with real instructor workflow needs</w:t>
+      </w:r>
+      <w:r>
+        <w:rPr>
+          <w:rFonts w:ascii="Arial" w:hAnsi="Arial" w:cs="Arial"/>
+        </w:rPr>
+        <w:t>.</w:t>
+      </w:r>
+    </w:p>
+    <w:p>
+      <w:pPr>
+        <w:pStyle w:val="ListParagraph"/>
+        <w:numPr>
+          <w:ilvl w:val="0"/>
+          <w:numId w:val="9"/>
+        </w:numPr>
+        <w:spacing w:line="240" w:lineRule="auto"/>
+        <w:rPr>
+          <w:rFonts w:ascii="Arial" w:hAnsi="Arial" w:cs="Arial"/>
+        </w:rPr>
+      </w:pPr>
+      <w:r>
+        <w:rPr>
+          <w:rFonts w:ascii="Arial" w:hAnsi="Arial" w:cs="Arial"/>
+        </w:rPr>
+        <w:t>Delivered a functional solution meeting instructor requirements for monitoring student engagement and performance</w:t>
+      </w:r>
+      <w:r>
+        <w:rPr>
+          <w:rFonts w:ascii="Arial" w:hAnsi="Arial" w:cs="Arial"/>
+        </w:rPr>
+        <w:t>.</w:t>
+      </w:r>
+    </w:p>
+    <w:p>
+      <w:pPr>
+        <w:pBdr>
+          <w:top w:val="single" w:sz="4" w:space="0" w:color="auto"/>
+        </w:pBdr>
+        <w:shd w:val="clear" w:color="auto" w:fill="D9D9D9" w:themeFill="background1" w:themeFillShade="D9"/>
+        <w:spacing w:line="240" w:lineRule="auto"/>
+        <w:jc w:val="center"/>
+        <w:rPr>
+          <w:rFonts w:ascii="Arial" w:hAnsi="Arial" w:cs="Arial"/>
+          <w:b/>
+          <w:bCs/>
+          <w:smallCaps/>
+          <w:sz w:val="23"/>
+          <w:szCs w:val="23"/>
+        </w:rPr>
+      </w:pPr>
+      <w:r>
+        <w:rPr>
+          <w:rFonts w:ascii="Arial" w:hAnsi="Arial" w:cs="Arial"/>
+          <w:b/>
+          <w:bCs/>
+          <w:smallCaps/>
+          <w:sz w:val="23"/>
+          <w:szCs w:val="23"/>
+        </w:rPr>
+        <w:t>Certifications</w:t>
+      </w:r>
+    </w:p>
+    <w:p>
+      <w:pPr>
+        <w:spacing w:after="0" w:line="240" w:lineRule="auto"/>
+        <w:rPr>
+          <w:rFonts w:ascii="Arial" w:hAnsi="Arial" w:cs="Arial"/>
+          <w:i/>
+          <w:iCs/>
+          <w:lang w:val="en-CA"/>
+        </w:rPr>
+      </w:pPr>
+      <w:r>
+        <w:rPr>
+          <w:rFonts w:ascii="Arial" w:hAnsi="Arial" w:cs="Arial"/>
+          <w:b/>
+          <w:bCs/>
+          <w:lang w:val="en-CA"/>
+        </w:rPr>
+        <w:t>Cisco Certified Network Associate (C</w:t>
+      </w:r>
+      <w:r>
+        <w:rPr>
+          <w:rFonts w:ascii="Arial" w:hAnsi="Arial" w:cs="Arial"/>
+          <w:b/>
+          <w:bCs/>
+          <w:lang w:val="en-CA"/>
+        </w:rPr>
+        <w:t>.</w:t>
+      </w:r>
+      <w:r>
+        <w:rPr>
+          <w:rFonts w:ascii="Arial" w:hAnsi="Arial" w:cs="Arial"/>
+          <w:b/>
+          <w:bCs/>
+          <w:lang w:val="en-CA"/>
+        </w:rPr>
+        <w:t>C</w:t>
+      </w:r>
+      <w:r>
+        <w:rPr>
+          <w:rFonts w:ascii="Arial" w:hAnsi="Arial" w:cs="Arial"/>
+          <w:b/>
+          <w:bCs/>
+          <w:lang w:val="en-CA"/>
+        </w:rPr>
+        <w:t>.</w:t>
+      </w:r>
+      <w:r>
+        <w:rPr>
+          <w:rFonts w:ascii="Arial" w:hAnsi="Arial" w:cs="Arial"/>
+          <w:b/>
+          <w:bCs/>
+          <w:lang w:val="en-CA"/>
+        </w:rPr>
+        <w:t>N</w:t>
+      </w:r>
+      <w:r>
+        <w:rPr>
+          <w:rFonts w:ascii="Arial" w:hAnsi="Arial" w:cs="Arial"/>
+          <w:b/>
+          <w:bCs/>
+          <w:lang w:val="en-CA"/>
+        </w:rPr>
+        <w:t>.</w:t>
+      </w:r>
+      <w:r>
+        <w:rPr>
+          <w:rFonts w:ascii="Arial" w:hAnsi="Arial" w:cs="Arial"/>
+          <w:b/>
+          <w:bCs/>
+          <w:lang w:val="en-CA"/>
+        </w:rPr>
+        <w:t>A)</w:t>
+      </w:r>
+    </w:p>
+    <w:p>
+      <w:pPr>
+        <w:spacing w:line="240" w:lineRule="auto"/>
+        <w:rPr>
+          <w:rFonts w:ascii="Arial" w:hAnsi="Arial" w:cs="Arial"/>
+          <w:lang w:val="en-CA"/>
+        </w:rPr>
+      </w:pPr>
+      <w:r>
+        <w:rPr>
+          <w:rFonts w:ascii="Arial" w:hAnsi="Arial" w:cs="Arial"/>
+          <w:i/>
+          <w:iCs/>
+          <w:lang w:val="en-CA"/>
+        </w:rPr>
+        <w:t>Cisco Systems, Inc.</w:t>
+      </w:r>
+      <w:r>
+        <w:rPr>
+          <w:rFonts w:ascii="Arial" w:hAnsi="Arial" w:cs="Arial"/>
+          <w:i/>
+          <w:iCs/>
+          <w:lang w:val="en-CA"/>
+        </w:rPr>
+        <w:t>, Delhi, India</w:t>
+      </w:r>
+      <w:r>
+        <w:rPr>
+          <w:rFonts w:ascii="Arial" w:hAnsi="Arial" w:cs="Arial"/>
+          <w:i/>
+          <w:iCs/>
+          <w:lang w:val="en-CA"/>
+        </w:rPr>
+        <w:t xml:space="preserve">                                                      </w:t>
+      </w:r>
+      <w:r>
+        <w:rPr>
+          <w:rFonts w:ascii="Arial" w:hAnsi="Arial" w:cs="Arial"/>
+          <w:lang w:val="en-CA"/>
+        </w:rPr>
+        <w:t xml:space="preserve">February 2020 </w:t>
+      </w:r>
+      <w:r>
+        <w:rPr>
+          <w:rFonts w:ascii="Arial" w:hAnsi="Arial" w:cs="Arial"/>
+          <w:lang w:val="en-CA"/>
+        </w:rPr>
+        <w:t>-</w:t>
+      </w:r>
+      <w:r>
+        <w:rPr>
+          <w:rFonts w:ascii="Arial" w:hAnsi="Arial" w:cs="Arial"/>
+          <w:lang w:val="en-CA"/>
+        </w:rPr>
+        <w:t xml:space="preserve"> August 2028</w:t>
+      </w:r>
+    </w:p>
+    <w:p>
+      <w:pPr>
+        <w:spacing w:line="240" w:lineRule="auto"/>
+        <w:rPr>
+          <w:rFonts w:ascii="Arial" w:hAnsi="Arial" w:cs="Arial"/>
+          <w:lang w:val="en-CA"/>
+        </w:rPr>
+      </w:pPr>
+      <w:r>
+        <w:rPr>
+          <w:rFonts w:ascii="Arial" w:hAnsi="Arial" w:cs="Arial"/>
+          <w:b/>
+          <w:bCs/>
+          <w:lang w:val="en-CA"/>
+        </w:rPr>
+        <w:t>Jetking Certified Hardware &amp; Networking Professional (Cloud)</w:t>
+      </w:r>
+      <w:r>
+        <w:rPr>
+          <w:rFonts w:ascii="Arial" w:hAnsi="Arial" w:cs="Arial"/>
+          <w:lang w:val="en-CA"/>
+        </w:rPr>
+        <w:br/>
+      </w:r>
+      <w:r>
+        <w:rPr>
+          <w:rFonts w:ascii="Arial" w:hAnsi="Arial" w:cs="Arial"/>
+          <w:i/>
+          <w:iCs/>
+          <w:lang w:val="en-CA"/>
+        </w:rPr>
+        <w:t>Jetking Infotrain Ltd.</w:t>
+      </w:r>
+      <w:r>
+        <w:rPr>
+          <w:rFonts w:ascii="Arial" w:hAnsi="Arial" w:cs="Arial"/>
+          <w:i/>
+          <w:iCs/>
+          <w:lang w:val="en-CA"/>
+        </w:rPr>
+        <w:t>, Delhi, India</w:t>
+      </w:r>
+      <w:r>
+        <w:rPr>
+          <w:rFonts w:ascii="Arial" w:hAnsi="Arial" w:cs="Arial"/>
+          <w:i/>
+          <w:iCs/>
+          <w:lang w:val="en-CA"/>
+        </w:rPr>
+        <w:t xml:space="preserve">                                                              </w:t>
+      </w:r>
+      <w:r>
+        <w:rPr>
+          <w:rFonts w:ascii="Arial" w:hAnsi="Arial" w:cs="Arial"/>
+          <w:lang w:val="en-CA"/>
+        </w:rPr>
+        <w:t>Completed</w:t>
+      </w:r>
+      <w:r>
+        <w:rPr>
+          <w:rFonts w:ascii="Arial" w:hAnsi="Arial" w:cs="Arial"/>
+          <w:lang w:val="en-CA"/>
+        </w:rPr>
+        <w:t>:</w:t>
+      </w:r>
+      <w:r>
+        <w:rPr>
+          <w:rFonts w:ascii="Arial" w:hAnsi="Arial" w:cs="Arial"/>
+          <w:lang w:val="en-CA"/>
+        </w:rPr>
+        <w:t xml:space="preserve"> March 2014</w:t>
+      </w:r>
+    </w:p>
+    <w:p>
+      <w:pPr>
+        <w:pBdr>
+          <w:top w:val="single" w:sz="4" w:space="0" w:color="auto"/>
+        </w:pBdr>
+        <w:shd w:val="clear" w:color="auto" w:fill="D9D9D9" w:themeFill="background1" w:themeFillShade="D9"/>
+        <w:spacing w:line="240" w:lineRule="auto"/>
+        <w:jc w:val="center"/>
+        <w:rPr>
+          <w:rFonts w:ascii="Arial" w:hAnsi="Arial" w:cs="Arial"/>
+          <w:b/>
+          <w:bCs/>
+          <w:smallCaps/>
+          <w:sz w:val="23"/>
+          <w:szCs w:val="23"/>
+        </w:rPr>
+      </w:pPr>
+      <w:r>
+        <w:rPr>
+          <w:rFonts w:ascii="Arial" w:hAnsi="Arial" w:cs="Arial"/>
+          <w:b/>
+          <w:bCs/>
+          <w:smallCaps/>
+          <w:sz w:val="23"/>
+          <w:szCs w:val="23"/>
+        </w:rPr>
+        <w:t>Education</w:t>
+      </w:r>
+    </w:p>
+    <w:p>
+      <w:pPr>
+        <w:spacing w:after="0" w:line="240" w:lineRule="auto"/>
+        <w:rPr>
+          <w:rFonts w:ascii="Arial" w:hAnsi="Arial" w:cs="Arial"/>
+          <w:b/>
+          <w:bCs/>
+          <w:sz w:val="23"/>
+          <w:szCs w:val="23"/>
+        </w:rPr>
+      </w:pPr>
+      <w:r>
+        <w:rPr>
+          <w:rFonts w:ascii="Arial" w:hAnsi="Arial" w:cs="Arial"/>
+          <w:b/>
+          <w:bCs/>
+          <w:sz w:val="23"/>
+          <w:szCs w:val="23"/>
+        </w:rPr>
+        <w:t>I.T Web Programming (Full-time Diploma)</w:t>
+      </w:r>
+    </w:p>
+    <w:p>
+      <w:pPr>
+        <w:tabs>
+          <w:tab w:val="right" w:pos="9360"/>
+        </w:tabs>
+        <w:spacing w:after="0" w:line="240" w:lineRule="auto"/>
+        <w:rPr>
+          <w:rFonts w:ascii="Arial" w:hAnsi="Arial" w:cs="Arial"/>
+        </w:rPr>
+      </w:pPr>
+      <w:r>
+        <w:rPr>
+          <w:rFonts w:ascii="Arial" w:hAnsi="Arial" w:cs="Arial"/>
+          <w:i/>
+          <w:iCs/>
+        </w:rPr>
+        <w:t>Nova Scotia Community College, Halifax, Canada</w:t>
+      </w:r>
+      <w:r>
+        <w:rPr>
+          <w:rFonts w:ascii="Arial" w:hAnsi="Arial" w:cs="Arial"/>
+        </w:rPr>
+        <w:tab/>
+        <w:t>Ongoing</w:t>
+      </w:r>
+    </w:p>
+    <w:p>
+      <w:pPr>
+        <w:tabs>
+          <w:tab w:val="right" w:pos="9360"/>
+        </w:tabs>
+        <w:spacing w:after="0" w:line="240" w:lineRule="auto"/>
+        <w:rPr>
+          <w:rFonts w:ascii="Arial" w:hAnsi="Arial" w:cs="Arial"/>
+        </w:rPr>
+      </w:pPr>
+      <w:r>
+        <w:rPr>
+          <w:rFonts w:ascii="Arial" w:hAnsi="Arial" w:cs="Arial"/>
+        </w:rPr>
+        <w:t>Expected Graduation: May 2026</w:t>
+      </w:r>
+    </w:p>
+    <w:p>
+      <w:pPr>
+        <w:tabs>
+          <w:tab w:val="right" w:pos="9360"/>
+        </w:tabs>
+        <w:spacing w:after="0" w:line="240" w:lineRule="auto"/>
+        <w:rPr>
+          <w:rFonts w:ascii="Arial" w:hAnsi="Arial" w:cs="Arial"/>
+        </w:rPr>
+      </w:pPr>
+    </w:p>
+    <w:p>
+      <w:pPr>
+        <w:tabs>
+          <w:tab w:val="right" w:pos="9360"/>
+        </w:tabs>
+        <w:spacing w:after="0" w:line="240" w:lineRule="auto"/>
+        <w:rPr>
+          <w:rFonts w:ascii="Arial" w:hAnsi="Arial" w:cs="Arial"/>
+          <w:i/>
+          <w:iCs/>
+          <w:lang w:val="en-CA"/>
+        </w:rPr>
+      </w:pPr>
+      <w:r>
+        <w:rPr>
+          <w:rFonts w:ascii="Arial" w:hAnsi="Arial" w:cs="Arial"/>
+          <w:b/>
+          <w:bCs/>
+          <w:lang w:val="en-CA"/>
+        </w:rPr>
+        <w:t>Business Administration</w:t>
+      </w:r>
+      <w:r>
+        <w:rPr>
+          <w:rFonts w:ascii="Arial" w:hAnsi="Arial" w:cs="Arial"/>
+          <w:b/>
+          <w:bCs/>
+          <w:lang w:val="en-CA"/>
+        </w:rPr>
+        <w:t xml:space="preserve"> (Full-time Master’s Degree)</w:t>
+      </w:r>
+      <w:r>
+        <w:rPr>
+          <w:rFonts w:ascii="Arial" w:hAnsi="Arial" w:cs="Arial"/>
+          <w:lang w:val="en-CA"/>
+        </w:rPr>
+        <w:br/>
+        <w:t>Guru Gobind Singh Indraprastha University – Delhi, India</w:t>
+      </w:r>
+      <w:r>
+        <w:rPr>
+          <w:rFonts w:ascii="Arial" w:hAnsi="Arial" w:cs="Arial"/>
+          <w:lang w:val="en-CA"/>
+        </w:rPr>
+        <w:t xml:space="preserve">                                   </w:t>
+      </w:r>
+      <w:r>
+        <w:rPr>
+          <w:rFonts w:ascii="Arial" w:hAnsi="Arial" w:cs="Arial"/>
+          <w:lang w:val="en-CA"/>
+        </w:rPr>
+        <w:t>Graduated: 2011</w:t>
+      </w:r>
+    </w:p>
+    <w:p>
+      <w:pPr>
+        <w:tabs>
+          <w:tab w:val="right" w:pos="9360"/>
+        </w:tabs>
+        <w:spacing w:after="0" w:line="240" w:lineRule="auto"/>
+        <w:rPr>
+          <w:rFonts w:ascii="Arial" w:hAnsi="Arial" w:cs="Arial"/>
+          <w:lang w:val="en-CA"/>
+        </w:rPr>
+      </w:pPr>
+    </w:p>
+    <w:p>
+      <w:pPr>
+        <w:tabs>
+          <w:tab w:val="right" w:pos="9360"/>
+        </w:tabs>
+        <w:spacing w:line="240" w:lineRule="auto"/>
+        <w:rPr>
+          <w:rFonts w:ascii="Arial" w:hAnsi="Arial" w:cs="Arial"/>
+          <w:lang w:val="en-CA"/>
+        </w:rPr>
         <w:sectPr>
+          <w:headerReference w:type="default" r:id="rId12"/>
+          <w:headerReference w:type="first" r:id="rId13"/>
           <w:type w:val="continuous"/>
           <w:pgSz w:w="12240" w:h="15840"/>
           <w:pgMar w:top="-286" w:right="1440" w:bottom="1170" w:left="1440" w:header="0" w:footer="708" w:gutter="0"/>
@@ -1716,6 +2137,46 @@
           <w:docGrid w:linePitch="360"/>
         </w:sectPr>
       </w:pPr>
+      <w:r>
+        <w:rPr>
+          <w:rFonts w:ascii="Arial" w:hAnsi="Arial" w:cs="Arial"/>
+          <w:b/>
+          <w:bCs/>
+          <w:lang w:val="en-CA"/>
+        </w:rPr>
+        <w:t>Commerce</w:t>
+      </w:r>
+      <w:r>
+        <w:rPr>
+          <w:rFonts w:ascii="Arial" w:hAnsi="Arial" w:cs="Arial"/>
+          <w:b/>
+          <w:bCs/>
+          <w:lang w:val="en-CA"/>
+        </w:rPr>
+        <w:t xml:space="preserve"> (Full-time Bachelor’s Degree)</w:t>
+      </w:r>
+      <w:r>
+        <w:rPr>
+          <w:rFonts w:ascii="Arial" w:hAnsi="Arial" w:cs="Arial"/>
+          <w:lang w:val="en-CA"/>
+        </w:rPr>
+        <w:br/>
+        <w:t>Delhi University – Delhi, India</w:t>
+      </w:r>
+      <w:r>
+        <w:rPr>
+          <w:rFonts w:ascii="Arial" w:hAnsi="Arial" w:cs="Arial"/>
+          <w:lang w:val="en-CA"/>
+        </w:rPr>
+        <w:t xml:space="preserve">                                                                               </w:t>
+      </w:r>
+      <w:r>
+        <w:rPr>
+          <w:rFonts w:ascii="Arial" w:hAnsi="Arial" w:cs="Arial"/>
+          <w:lang w:val="en-CA"/>
+        </w:rPr>
+        <w:t>Graduated: 2009</w:t>
+      </w:r>
     </w:p>
     <w:p>
       <w:pPr>
@@ -1866,7 +2327,7 @@
           <w:ilvl w:val="0"/>
           <w:numId w:val="1"/>
         </w:numPr>
-        <w:spacing w:after="0" w:line="240" w:lineRule="auto"/>
+        <w:spacing w:line="240" w:lineRule="auto"/>
         <w:rPr>
           <w:rFonts w:ascii="Arial" w:hAnsi="Arial" w:cs="Arial"/>
           <w:b/>
@@ -1884,14 +2345,6 @@
           <w:rFonts w:ascii="Arial" w:hAnsi="Arial" w:cs="Arial"/>
         </w:rPr>
         <w:t>.</w:t>
-      </w:r>
-      <w:r>
-        <w:rPr>
-          <w:rFonts w:ascii="Arial" w:hAnsi="Arial" w:cs="Arial"/>
-          <w:b/>
-          <w:bCs/>
-        </w:rPr>
-        <w:t xml:space="preserve"> </w:t>
       </w:r>
     </w:p>
     <w:p>
@@ -2010,7 +2463,7 @@
           <w:ilvl w:val="0"/>
           <w:numId w:val="1"/>
         </w:numPr>
-        <w:spacing w:after="0" w:line="240" w:lineRule="auto"/>
+        <w:spacing w:line="240" w:lineRule="auto"/>
         <w:rPr>
           <w:rFonts w:ascii="Arial" w:hAnsi="Arial" w:cs="Arial"/>
         </w:rPr>
@@ -2151,6 +2604,7 @@
         <w:rPr>
           <w:rFonts w:ascii="Arial" w:hAnsi="Arial" w:cs="Arial"/>
         </w:rPr>
+        <w:lastRenderedPageBreak/>
         <w:t>Managed multiple assigned tasks and project requirements with a high level of accuracy</w:t>
       </w:r>
       <w:r>
@@ -2167,7 +2621,7 @@
           <w:ilvl w:val="0"/>
           <w:numId w:val="2"/>
         </w:numPr>
-        <w:spacing w:after="0" w:line="240" w:lineRule="auto"/>
+        <w:spacing w:line="240" w:lineRule="auto"/>
         <w:rPr>
           <w:rFonts w:ascii="Arial" w:hAnsi="Arial" w:cs="Arial"/>
         </w:rPr>
@@ -2309,7 +2763,7 @@
           <w:ilvl w:val="0"/>
           <w:numId w:val="1"/>
         </w:numPr>
-        <w:spacing w:after="0" w:line="240" w:lineRule="auto"/>
+        <w:spacing w:line="240" w:lineRule="auto"/>
         <w:rPr>
           <w:rFonts w:ascii="Arial" w:hAnsi="Arial" w:cs="Arial"/>
         </w:rPr>
@@ -2626,9 +3080,26 @@
         <w:t>.</w:t>
       </w:r>
     </w:p>
+    <w:p>
+      <w:pPr>
+        <w:spacing w:line="240" w:lineRule="auto"/>
+        <w:jc w:val="center"/>
+        <w:rPr>
+          <w:rFonts w:ascii="Arial" w:hAnsi="Arial" w:cs="Arial"/>
+          <w:b/>
+        </w:rPr>
+      </w:pPr>
+      <w:r>
+        <w:rPr>
+          <w:rFonts w:ascii="Arial" w:hAnsi="Arial" w:cs="Arial"/>
+          <w:b/>
+        </w:rPr>
+        <w:t>References are available on request</w:t>
+      </w:r>
+    </w:p>
     <w:sectPr>
-      <w:headerReference w:type="default" r:id="rId12"/>
-      <w:headerReference w:type="first" r:id="rId13"/>
+      <w:headerReference w:type="default" r:id="rId14"/>
+      <w:headerReference w:type="first" r:id="rId15"/>
       <w:type w:val="continuous"/>
       <w:pgSz w:w="12240" w:h="15840"/>
       <w:pgMar w:top="284" w:right="1440" w:bottom="1170" w:left="1440" w:header="0" w:footer="708" w:gutter="0"/>
@@ -2697,7 +3168,7 @@
         <w:color w:val="7F7F7F" w:themeColor="background1" w:themeShade="7F"/>
         <w:spacing w:val="60"/>
       </w:rPr>
-      <w:id w:val="1290538893"/>
+      <w:id w:val="328212657"/>
       <w:docPartObj>
         <w:docPartGallery w:val="Page Numbers (Top of Page)"/>
         <w:docPartUnique/>
@@ -2750,7 +3221,7 @@
             <w:bCs/>
             <w:noProof/>
           </w:rPr>
-          <w:t>2</w:t>
+          <w:t>1</w:t>
         </w:r>
         <w:r>
           <w:rPr>
@@ -2779,7 +3250,7 @@
         <w:color w:val="7F7F7F" w:themeColor="background1" w:themeShade="7F"/>
         <w:spacing w:val="60"/>
       </w:rPr>
-      <w:id w:val="1290538894"/>
+      <w:id w:val="328212658"/>
       <w:docPartObj>
         <w:docPartGallery w:val="Page Numbers (Top of Page)"/>
         <w:docPartUnique/>
@@ -2855,6 +3326,170 @@
 
 <file path=word/header3.xml><?xml version="1.0" encoding="utf-8"?>
 <w:hdr xmlns:ve="http://schemas.openxmlformats.org/markup-compatibility/2006" xmlns:o="urn:schemas-microsoft-com:office:office" xmlns:r="http://schemas.openxmlformats.org/officeDocument/2006/relationships" xmlns:m="http://schemas.openxmlformats.org/officeDocument/2006/math" xmlns:v="urn:schemas-microsoft-com:vml" xmlns:wp="http://schemas.openxmlformats.org/drawingml/2006/wordprocessingDrawing" xmlns:w10="urn:schemas-microsoft-com:office:word" xmlns:w="http://schemas.openxmlformats.org/wordprocessingml/2006/main" xmlns:wne="http://schemas.microsoft.com/office/word/2006/wordml">
+  <w:sdt>
+    <w:sdtPr>
+      <w:rPr>
+        <w:color w:val="7F7F7F" w:themeColor="background1" w:themeShade="7F"/>
+        <w:spacing w:val="60"/>
+      </w:rPr>
+      <w:id w:val="1290538893"/>
+      <w:docPartObj>
+        <w:docPartGallery w:val="Page Numbers (Top of Page)"/>
+        <w:docPartUnique/>
+      </w:docPartObj>
+    </w:sdtPr>
+    <w:sdtEndPr>
+      <w:rPr>
+        <w:b/>
+        <w:bCs/>
+        <w:noProof/>
+        <w:color w:val="auto"/>
+        <w:spacing w:val="0"/>
+      </w:rPr>
+    </w:sdtEndPr>
+    <w:sdtContent>
+      <w:p>
+        <w:pPr>
+          <w:pStyle w:val="Header"/>
+          <w:pBdr>
+            <w:bottom w:val="single" w:sz="4" w:space="1" w:color="D9D9D9" w:themeColor="background1" w:themeShade="D9"/>
+          </w:pBdr>
+          <w:jc w:val="right"/>
+          <w:rPr>
+            <w:b/>
+            <w:bCs/>
+          </w:rPr>
+        </w:pPr>
+        <w:r>
+          <w:rPr>
+            <w:color w:val="7F7F7F" w:themeColor="background1" w:themeShade="7F"/>
+            <w:spacing w:val="60"/>
+          </w:rPr>
+          <w:t>Page</w:t>
+        </w:r>
+        <w:r>
+          <w:t xml:space="preserve"> | </w:t>
+        </w:r>
+        <w:r>
+          <w:fldChar w:fldCharType="begin"/>
+        </w:r>
+        <w:r>
+          <w:instrText xml:space="preserve"> PAGE   \* MERGEFORMAT </w:instrText>
+        </w:r>
+        <w:r>
+          <w:fldChar w:fldCharType="separate"/>
+        </w:r>
+        <w:r>
+          <w:rPr>
+            <w:b/>
+            <w:bCs/>
+            <w:noProof/>
+          </w:rPr>
+          <w:t>2</w:t>
+        </w:r>
+        <w:r>
+          <w:rPr>
+            <w:b/>
+            <w:bCs/>
+            <w:noProof/>
+          </w:rPr>
+          <w:fldChar w:fldCharType="end"/>
+        </w:r>
+      </w:p>
+    </w:sdtContent>
+  </w:sdt>
+  <w:p>
+    <w:pPr>
+      <w:pStyle w:val="Header"/>
+    </w:pPr>
+  </w:p>
+</w:hdr>
+</file>
+
+<file path=word/header4.xml><?xml version="1.0" encoding="utf-8"?>
+<w:hdr xmlns:ve="http://schemas.openxmlformats.org/markup-compatibility/2006" xmlns:o="urn:schemas-microsoft-com:office:office" xmlns:r="http://schemas.openxmlformats.org/officeDocument/2006/relationships" xmlns:m="http://schemas.openxmlformats.org/officeDocument/2006/math" xmlns:v="urn:schemas-microsoft-com:vml" xmlns:wp="http://schemas.openxmlformats.org/drawingml/2006/wordprocessingDrawing" xmlns:w10="urn:schemas-microsoft-com:office:word" xmlns:w="http://schemas.openxmlformats.org/wordprocessingml/2006/main" xmlns:wne="http://schemas.microsoft.com/office/word/2006/wordml">
+  <w:sdt>
+    <w:sdtPr>
+      <w:rPr>
+        <w:color w:val="7F7F7F" w:themeColor="background1" w:themeShade="7F"/>
+        <w:spacing w:val="60"/>
+      </w:rPr>
+      <w:id w:val="1290538894"/>
+      <w:docPartObj>
+        <w:docPartGallery w:val="Page Numbers (Top of Page)"/>
+        <w:docPartUnique/>
+      </w:docPartObj>
+    </w:sdtPr>
+    <w:sdtEndPr>
+      <w:rPr>
+        <w:b/>
+        <w:bCs/>
+        <w:noProof/>
+        <w:color w:val="auto"/>
+        <w:spacing w:val="0"/>
+      </w:rPr>
+    </w:sdtEndPr>
+    <w:sdtContent>
+      <w:p>
+        <w:pPr>
+          <w:pStyle w:val="Header"/>
+          <w:pBdr>
+            <w:bottom w:val="single" w:sz="4" w:space="1" w:color="D9D9D9" w:themeColor="background1" w:themeShade="D9"/>
+          </w:pBdr>
+          <w:jc w:val="right"/>
+          <w:rPr>
+            <w:b/>
+            <w:bCs/>
+          </w:rPr>
+        </w:pPr>
+        <w:r>
+          <w:rPr>
+            <w:color w:val="7F7F7F" w:themeColor="background1" w:themeShade="7F"/>
+            <w:spacing w:val="60"/>
+          </w:rPr>
+          <w:t>Page</w:t>
+        </w:r>
+        <w:r>
+          <w:t xml:space="preserve"> | </w:t>
+        </w:r>
+        <w:r>
+          <w:fldChar w:fldCharType="begin"/>
+        </w:r>
+        <w:r>
+          <w:instrText xml:space="preserve"> PAGE   \* MERGEFORMAT </w:instrText>
+        </w:r>
+        <w:r>
+          <w:fldChar w:fldCharType="separate"/>
+        </w:r>
+        <w:r>
+          <w:rPr>
+            <w:b/>
+            <w:bCs/>
+            <w:noProof/>
+          </w:rPr>
+          <w:t>2</w:t>
+        </w:r>
+        <w:r>
+          <w:rPr>
+            <w:b/>
+            <w:bCs/>
+            <w:noProof/>
+          </w:rPr>
+          <w:fldChar w:fldCharType="end"/>
+        </w:r>
+      </w:p>
+    </w:sdtContent>
+  </w:sdt>
+  <w:p>
+    <w:pPr>
+      <w:pStyle w:val="Header"/>
+    </w:pPr>
+  </w:p>
+</w:hdr>
+</file>
+
+<file path=word/header5.xml><?xml version="1.0" encoding="utf-8"?>
+<w:hdr xmlns:ve="http://schemas.openxmlformats.org/markup-compatibility/2006" xmlns:o="urn:schemas-microsoft-com:office:office" xmlns:r="http://schemas.openxmlformats.org/officeDocument/2006/relationships" xmlns:m="http://schemas.openxmlformats.org/officeDocument/2006/math" xmlns:v="urn:schemas-microsoft-com:vml" xmlns:wp="http://schemas.openxmlformats.org/drawingml/2006/wordprocessingDrawing" xmlns:w10="urn:schemas-microsoft-com:office:word" xmlns:w="http://schemas.openxmlformats.org/wordprocessingml/2006/main" xmlns:wne="http://schemas.microsoft.com/office/word/2006/wordml">
   <w:p>
     <w:pPr>
       <w:pStyle w:val="Header"/>
@@ -2911,7 +3546,7 @@
 </w:hdr>
 </file>
 
-<file path=word/header4.xml><?xml version="1.0" encoding="utf-8"?>
+<file path=word/header6.xml><?xml version="1.0" encoding="utf-8"?>
 <w:hdr xmlns:ve="http://schemas.openxmlformats.org/markup-compatibility/2006" xmlns:o="urn:schemas-microsoft-com:office:office" xmlns:r="http://schemas.openxmlformats.org/officeDocument/2006/relationships" xmlns:m="http://schemas.openxmlformats.org/officeDocument/2006/math" xmlns:v="urn:schemas-microsoft-com:vml" xmlns:wp="http://schemas.openxmlformats.org/drawingml/2006/wordprocessingDrawing" xmlns:w10="urn:schemas-microsoft-com:office:word" xmlns:w="http://schemas.openxmlformats.org/wordprocessingml/2006/main" xmlns:wne="http://schemas.microsoft.com/office/word/2006/wordml">
   <w:p>
     <w:pPr>
@@ -3311,6 +3946,96 @@
     </w:lvl>
   </w:abstractNum>
   <w:abstractNum w:abstractNumId="3">
+    <w:nsid w:val="3D98344B"/>
+    <w:multiLevelType w:val="hybridMultilevel"/>
+    <w:tmpl w:val="C9A2E36C"/>
+    <w:lvl w:ilvl="0" w:tplc="31F638F8">
+      <w:start w:val="1"/>
+      <w:numFmt w:val="decimal"/>
+      <w:lvlText w:val="%1."/>
+      <w:lvlJc w:val="left"/>
+      <w:pPr>
+        <w:ind w:left="720" w:hanging="360"/>
+      </w:pPr>
+      <w:rPr>
+        <w:rFonts w:hint="default"/>
+        <w:b/>
+      </w:rPr>
+    </w:lvl>
+    <w:lvl w:ilvl="1" w:tplc="04090019" w:tentative="1">
+      <w:start w:val="1"/>
+      <w:numFmt w:val="lowerLetter"/>
+      <w:lvlText w:val="%2."/>
+      <w:lvlJc w:val="left"/>
+      <w:pPr>
+        <w:ind w:left="1440" w:hanging="360"/>
+      </w:pPr>
+    </w:lvl>
+    <w:lvl w:ilvl="2" w:tplc="0409001B" w:tentative="1">
+      <w:start w:val="1"/>
+      <w:numFmt w:val="lowerRoman"/>
+      <w:lvlText w:val="%3."/>
+      <w:lvlJc w:val="right"/>
+      <w:pPr>
+        <w:ind w:left="2160" w:hanging="180"/>
+      </w:pPr>
+    </w:lvl>
+    <w:lvl w:ilvl="3" w:tplc="0409000F" w:tentative="1">
+      <w:start w:val="1"/>
+      <w:numFmt w:val="decimal"/>
+      <w:lvlText w:val="%4."/>
+      <w:lvlJc w:val="left"/>
+      <w:pPr>
+        <w:ind w:left="2880" w:hanging="360"/>
+      </w:pPr>
+    </w:lvl>
+    <w:lvl w:ilvl="4" w:tplc="04090019" w:tentative="1">
+      <w:start w:val="1"/>
+      <w:numFmt w:val="lowerLetter"/>
+      <w:lvlText w:val="%5."/>
+      <w:lvlJc w:val="left"/>
+      <w:pPr>
+        <w:ind w:left="3600" w:hanging="360"/>
+      </w:pPr>
+    </w:lvl>
+    <w:lvl w:ilvl="5" w:tplc="0409001B" w:tentative="1">
+      <w:start w:val="1"/>
+      <w:numFmt w:val="lowerRoman"/>
+      <w:lvlText w:val="%6."/>
+      <w:lvlJc w:val="right"/>
+      <w:pPr>
+        <w:ind w:left="4320" w:hanging="180"/>
+      </w:pPr>
+    </w:lvl>
+    <w:lvl w:ilvl="6" w:tplc="0409000F" w:tentative="1">
+      <w:start w:val="1"/>
+      <w:numFmt w:val="decimal"/>
+      <w:lvlText w:val="%7."/>
+      <w:lvlJc w:val="left"/>
+      <w:pPr>
+        <w:ind w:left="5040" w:hanging="360"/>
+      </w:pPr>
+    </w:lvl>
+    <w:lvl w:ilvl="7" w:tplc="04090019" w:tentative="1">
+      <w:start w:val="1"/>
+      <w:numFmt w:val="lowerLetter"/>
+      <w:lvlText w:val="%8."/>
+      <w:lvlJc w:val="left"/>
+      <w:pPr>
+        <w:ind w:left="5760" w:hanging="360"/>
+      </w:pPr>
+    </w:lvl>
+    <w:lvl w:ilvl="8" w:tplc="0409001B" w:tentative="1">
+      <w:start w:val="1"/>
+      <w:numFmt w:val="lowerRoman"/>
+      <w:lvlText w:val="%9."/>
+      <w:lvlJc w:val="right"/>
+      <w:pPr>
+        <w:ind w:left="6480" w:hanging="180"/>
+      </w:pPr>
+    </w:lvl>
+  </w:abstractNum>
+  <w:abstractNum w:abstractNumId="4">
     <w:nsid w:val="4072059E"/>
     <w:multiLevelType w:val="hybridMultilevel"/>
     <w:tmpl w:val="4ACE2B84"/>
@@ -3423,7 +4148,346 @@
       </w:rPr>
     </w:lvl>
   </w:abstractNum>
-  <w:abstractNum w:abstractNumId="4">
+  <w:abstractNum w:abstractNumId="5">
+    <w:nsid w:val="51805D3F"/>
+    <w:multiLevelType w:val="hybridMultilevel"/>
+    <w:tmpl w:val="F808CF42"/>
+    <w:lvl w:ilvl="0" w:tplc="04090001">
+      <w:start w:val="1"/>
+      <w:numFmt w:val="bullet"/>
+      <w:lvlText w:val=""/>
+      <w:lvlJc w:val="left"/>
+      <w:pPr>
+        <w:ind w:left="720" w:hanging="360"/>
+      </w:pPr>
+      <w:rPr>
+        <w:rFonts w:ascii="Symbol" w:hAnsi="Symbol" w:hint="default"/>
+      </w:rPr>
+    </w:lvl>
+    <w:lvl w:ilvl="1" w:tplc="04090003" w:tentative="1">
+      <w:start w:val="1"/>
+      <w:numFmt w:val="bullet"/>
+      <w:lvlText w:val="o"/>
+      <w:lvlJc w:val="left"/>
+      <w:pPr>
+        <w:ind w:left="1440" w:hanging="360"/>
+      </w:pPr>
+      <w:rPr>
+        <w:rFonts w:ascii="Courier New" w:hAnsi="Courier New" w:cs="Courier New" w:hint="default"/>
+      </w:rPr>
+    </w:lvl>
+    <w:lvl w:ilvl="2" w:tplc="04090005" w:tentative="1">
+      <w:start w:val="1"/>
+      <w:numFmt w:val="bullet"/>
+      <w:lvlText w:val=""/>
+      <w:lvlJc w:val="left"/>
+      <w:pPr>
+        <w:ind w:left="2160" w:hanging="360"/>
+      </w:pPr>
+      <w:rPr>
+        <w:rFonts w:ascii="Wingdings" w:hAnsi="Wingdings" w:hint="default"/>
+      </w:rPr>
+    </w:lvl>
+    <w:lvl w:ilvl="3" w:tplc="04090001" w:tentative="1">
+      <w:start w:val="1"/>
+      <w:numFmt w:val="bullet"/>
+      <w:lvlText w:val=""/>
+      <w:lvlJc w:val="left"/>
+      <w:pPr>
+        <w:ind w:left="2880" w:hanging="360"/>
+      </w:pPr>
+      <w:rPr>
+        <w:rFonts w:ascii="Symbol" w:hAnsi="Symbol" w:hint="default"/>
+      </w:rPr>
+    </w:lvl>
+    <w:lvl w:ilvl="4" w:tplc="04090003" w:tentative="1">
+      <w:start w:val="1"/>
+      <w:numFmt w:val="bullet"/>
+      <w:lvlText w:val="o"/>
+      <w:lvlJc w:val="left"/>
+      <w:pPr>
+        <w:ind w:left="3600" w:hanging="360"/>
+      </w:pPr>
+      <w:rPr>
+        <w:rFonts w:ascii="Courier New" w:hAnsi="Courier New" w:cs="Courier New" w:hint="default"/>
+      </w:rPr>
+    </w:lvl>
+    <w:lvl w:ilvl="5" w:tplc="04090005" w:tentative="1">
+      <w:start w:val="1"/>
+      <w:numFmt w:val="bullet"/>
+      <w:lvlText w:val=""/>
+      <w:lvlJc w:val="left"/>
+      <w:pPr>
+        <w:ind w:left="4320" w:hanging="360"/>
+      </w:pPr>
+      <w:rPr>
+        <w:rFonts w:ascii="Wingdings" w:hAnsi="Wingdings" w:hint="default"/>
+      </w:rPr>
+    </w:lvl>
+    <w:lvl w:ilvl="6" w:tplc="04090001" w:tentative="1">
+      <w:start w:val="1"/>
+      <w:numFmt w:val="bullet"/>
+      <w:lvlText w:val=""/>
+      <w:lvlJc w:val="left"/>
+      <w:pPr>
+        <w:ind w:left="5040" w:hanging="360"/>
+      </w:pPr>
+      <w:rPr>
+        <w:rFonts w:ascii="Symbol" w:hAnsi="Symbol" w:hint="default"/>
+      </w:rPr>
+    </w:lvl>
+    <w:lvl w:ilvl="7" w:tplc="04090003" w:tentative="1">
+      <w:start w:val="1"/>
+      <w:numFmt w:val="bullet"/>
+      <w:lvlText w:val="o"/>
+      <w:lvlJc w:val="left"/>
+      <w:pPr>
+        <w:ind w:left="5760" w:hanging="360"/>
+      </w:pPr>
+      <w:rPr>
+        <w:rFonts w:ascii="Courier New" w:hAnsi="Courier New" w:cs="Courier New" w:hint="default"/>
+      </w:rPr>
+    </w:lvl>
+    <w:lvl w:ilvl="8" w:tplc="04090005" w:tentative="1">
+      <w:start w:val="1"/>
+      <w:numFmt w:val="bullet"/>
+      <w:lvlText w:val=""/>
+      <w:lvlJc w:val="left"/>
+      <w:pPr>
+        <w:ind w:left="6480" w:hanging="360"/>
+      </w:pPr>
+      <w:rPr>
+        <w:rFonts w:ascii="Wingdings" w:hAnsi="Wingdings" w:hint="default"/>
+      </w:rPr>
+    </w:lvl>
+  </w:abstractNum>
+  <w:abstractNum w:abstractNumId="6">
+    <w:nsid w:val="51E465FA"/>
+    <w:multiLevelType w:val="hybridMultilevel"/>
+    <w:tmpl w:val="E3DC182A"/>
+    <w:lvl w:ilvl="0" w:tplc="04090001">
+      <w:start w:val="1"/>
+      <w:numFmt w:val="bullet"/>
+      <w:lvlText w:val=""/>
+      <w:lvlJc w:val="left"/>
+      <w:pPr>
+        <w:ind w:left="720" w:hanging="360"/>
+      </w:pPr>
+      <w:rPr>
+        <w:rFonts w:ascii="Symbol" w:hAnsi="Symbol" w:hint="default"/>
+      </w:rPr>
+    </w:lvl>
+    <w:lvl w:ilvl="1" w:tplc="04090003" w:tentative="1">
+      <w:start w:val="1"/>
+      <w:numFmt w:val="bullet"/>
+      <w:lvlText w:val="o"/>
+      <w:lvlJc w:val="left"/>
+      <w:pPr>
+        <w:ind w:left="1440" w:hanging="360"/>
+      </w:pPr>
+      <w:rPr>
+        <w:rFonts w:ascii="Courier New" w:hAnsi="Courier New" w:cs="Courier New" w:hint="default"/>
+      </w:rPr>
+    </w:lvl>
+    <w:lvl w:ilvl="2" w:tplc="04090005" w:tentative="1">
+      <w:start w:val="1"/>
+      <w:numFmt w:val="bullet"/>
+      <w:lvlText w:val=""/>
+      <w:lvlJc w:val="left"/>
+      <w:pPr>
+        <w:ind w:left="2160" w:hanging="360"/>
+      </w:pPr>
+      <w:rPr>
+        <w:rFonts w:ascii="Wingdings" w:hAnsi="Wingdings" w:hint="default"/>
+      </w:rPr>
+    </w:lvl>
+    <w:lvl w:ilvl="3" w:tplc="04090001" w:tentative="1">
+      <w:start w:val="1"/>
+      <w:numFmt w:val="bullet"/>
+      <w:lvlText w:val=""/>
+      <w:lvlJc w:val="left"/>
+      <w:pPr>
+        <w:ind w:left="2880" w:hanging="360"/>
+      </w:pPr>
+      <w:rPr>
+        <w:rFonts w:ascii="Symbol" w:hAnsi="Symbol" w:hint="default"/>
+      </w:rPr>
+    </w:lvl>
+    <w:lvl w:ilvl="4" w:tplc="04090003" w:tentative="1">
+      <w:start w:val="1"/>
+      <w:numFmt w:val="bullet"/>
+      <w:lvlText w:val="o"/>
+      <w:lvlJc w:val="left"/>
+      <w:pPr>
+        <w:ind w:left="3600" w:hanging="360"/>
+      </w:pPr>
+      <w:rPr>
+        <w:rFonts w:ascii="Courier New" w:hAnsi="Courier New" w:cs="Courier New" w:hint="default"/>
+      </w:rPr>
+    </w:lvl>
+    <w:lvl w:ilvl="5" w:tplc="04090005" w:tentative="1">
+      <w:start w:val="1"/>
+      <w:numFmt w:val="bullet"/>
+      <w:lvlText w:val=""/>
+      <w:lvlJc w:val="left"/>
+      <w:pPr>
+        <w:ind w:left="4320" w:hanging="360"/>
+      </w:pPr>
+      <w:rPr>
+        <w:rFonts w:ascii="Wingdings" w:hAnsi="Wingdings" w:hint="default"/>
+      </w:rPr>
+    </w:lvl>
+    <w:lvl w:ilvl="6" w:tplc="04090001" w:tentative="1">
+      <w:start w:val="1"/>
+      <w:numFmt w:val="bullet"/>
+      <w:lvlText w:val=""/>
+      <w:lvlJc w:val="left"/>
+      <w:pPr>
+        <w:ind w:left="5040" w:hanging="360"/>
+      </w:pPr>
+      <w:rPr>
+        <w:rFonts w:ascii="Symbol" w:hAnsi="Symbol" w:hint="default"/>
+      </w:rPr>
+    </w:lvl>
+    <w:lvl w:ilvl="7" w:tplc="04090003" w:tentative="1">
+      <w:start w:val="1"/>
+      <w:numFmt w:val="bullet"/>
+      <w:lvlText w:val="o"/>
+      <w:lvlJc w:val="left"/>
+      <w:pPr>
+        <w:ind w:left="5760" w:hanging="360"/>
+      </w:pPr>
+      <w:rPr>
+        <w:rFonts w:ascii="Courier New" w:hAnsi="Courier New" w:cs="Courier New" w:hint="default"/>
+      </w:rPr>
+    </w:lvl>
+    <w:lvl w:ilvl="8" w:tplc="04090005" w:tentative="1">
+      <w:start w:val="1"/>
+      <w:numFmt w:val="bullet"/>
+      <w:lvlText w:val=""/>
+      <w:lvlJc w:val="left"/>
+      <w:pPr>
+        <w:ind w:left="6480" w:hanging="360"/>
+      </w:pPr>
+      <w:rPr>
+        <w:rFonts w:ascii="Wingdings" w:hAnsi="Wingdings" w:hint="default"/>
+      </w:rPr>
+    </w:lvl>
+  </w:abstractNum>
+  <w:abstractNum w:abstractNumId="7">
+    <w:nsid w:val="6F862A00"/>
+    <w:multiLevelType w:val="hybridMultilevel"/>
+    <w:tmpl w:val="F5AE9E14"/>
+    <w:lvl w:ilvl="0" w:tplc="04090001">
+      <w:start w:val="1"/>
+      <w:numFmt w:val="bullet"/>
+      <w:lvlText w:val=""/>
+      <w:lvlJc w:val="left"/>
+      <w:pPr>
+        <w:ind w:left="720" w:hanging="360"/>
+      </w:pPr>
+      <w:rPr>
+        <w:rFonts w:ascii="Symbol" w:hAnsi="Symbol" w:hint="default"/>
+      </w:rPr>
+    </w:lvl>
+    <w:lvl w:ilvl="1" w:tplc="04090003" w:tentative="1">
+      <w:start w:val="1"/>
+      <w:numFmt w:val="bullet"/>
+      <w:lvlText w:val="o"/>
+      <w:lvlJc w:val="left"/>
+      <w:pPr>
+        <w:ind w:left="1440" w:hanging="360"/>
+      </w:pPr>
+      <w:rPr>
+        <w:rFonts w:ascii="Courier New" w:hAnsi="Courier New" w:cs="Courier New" w:hint="default"/>
+      </w:rPr>
+    </w:lvl>
+    <w:lvl w:ilvl="2" w:tplc="04090005" w:tentative="1">
+      <w:start w:val="1"/>
+      <w:numFmt w:val="bullet"/>
+      <w:lvlText w:val=""/>
+      <w:lvlJc w:val="left"/>
+      <w:pPr>
+        <w:ind w:left="2160" w:hanging="360"/>
+      </w:pPr>
+      <w:rPr>
+        <w:rFonts w:ascii="Wingdings" w:hAnsi="Wingdings" w:hint="default"/>
+      </w:rPr>
+    </w:lvl>
+    <w:lvl w:ilvl="3" w:tplc="04090001" w:tentative="1">
+      <w:start w:val="1"/>
+      <w:numFmt w:val="bullet"/>
+      <w:lvlText w:val=""/>
+      <w:lvlJc w:val="left"/>
+      <w:pPr>
+        <w:ind w:left="2880" w:hanging="360"/>
+      </w:pPr>
+      <w:rPr>
+        <w:rFonts w:ascii="Symbol" w:hAnsi="Symbol" w:hint="default"/>
+      </w:rPr>
+    </w:lvl>
+    <w:lvl w:ilvl="4" w:tplc="04090003" w:tentative="1">
+      <w:start w:val="1"/>
+      <w:numFmt w:val="bullet"/>
+      <w:lvlText w:val="o"/>
+      <w:lvlJc w:val="left"/>
+      <w:pPr>
+        <w:ind w:left="3600" w:hanging="360"/>
+      </w:pPr>
+      <w:rPr>
+        <w:rFonts w:ascii="Courier New" w:hAnsi="Courier New" w:cs="Courier New" w:hint="default"/>
+      </w:rPr>
+    </w:lvl>
+    <w:lvl w:ilvl="5" w:tplc="04090005" w:tentative="1">
+      <w:start w:val="1"/>
+      <w:numFmt w:val="bullet"/>
+      <w:lvlText w:val=""/>
+      <w:lvlJc w:val="left"/>
+      <w:pPr>
+        <w:ind w:left="4320" w:hanging="360"/>
+      </w:pPr>
+      <w:rPr>
+        <w:rFonts w:ascii="Wingdings" w:hAnsi="Wingdings" w:hint="default"/>
+      </w:rPr>
+    </w:lvl>
+    <w:lvl w:ilvl="6" w:tplc="04090001" w:tentative="1">
+      <w:start w:val="1"/>
+      <w:numFmt w:val="bullet"/>
+      <w:lvlText w:val=""/>
+      <w:lvlJc w:val="left"/>
+      <w:pPr>
+        <w:ind w:left="5040" w:hanging="360"/>
+      </w:pPr>
+      <w:rPr>
+        <w:rFonts w:ascii="Symbol" w:hAnsi="Symbol" w:hint="default"/>
+      </w:rPr>
+    </w:lvl>
+    <w:lvl w:ilvl="7" w:tplc="04090003" w:tentative="1">
+      <w:start w:val="1"/>
+      <w:numFmt w:val="bullet"/>
+      <w:lvlText w:val="o"/>
+      <w:lvlJc w:val="left"/>
+      <w:pPr>
+        <w:ind w:left="5760" w:hanging="360"/>
+      </w:pPr>
+      <w:rPr>
+        <w:rFonts w:ascii="Courier New" w:hAnsi="Courier New" w:cs="Courier New" w:hint="default"/>
+      </w:rPr>
+    </w:lvl>
+    <w:lvl w:ilvl="8" w:tplc="04090005" w:tentative="1">
+      <w:start w:val="1"/>
+      <w:numFmt w:val="bullet"/>
+      <w:lvlText w:val=""/>
+      <w:lvlJc w:val="left"/>
+      <w:pPr>
+        <w:ind w:left="6480" w:hanging="360"/>
+      </w:pPr>
+      <w:rPr>
+        <w:rFonts w:ascii="Wingdings" w:hAnsi="Wingdings" w:hint="default"/>
+      </w:rPr>
+    </w:lvl>
+  </w:abstractNum>
+  <w:abstractNum w:abstractNumId="8">
     <w:nsid w:val="7D8531D6"/>
     <w:multiLevelType w:val="hybridMultilevel"/>
     <w:tmpl w:val="2E280376"/>
@@ -3543,13 +4607,25 @@
     <w:abstractNumId w:val="2"/>
   </w:num>
   <w:num w:numId="3">
-    <w:abstractNumId w:val="4"/>
+    <w:abstractNumId w:val="8"/>
   </w:num>
   <w:num w:numId="4">
-    <w:abstractNumId w:val="3"/>
+    <w:abstractNumId w:val="4"/>
   </w:num>
   <w:num w:numId="5">
     <w:abstractNumId w:val="0"/>
+  </w:num>
+  <w:num w:numId="6">
+    <w:abstractNumId w:val="3"/>
+  </w:num>
+  <w:num w:numId="7">
+    <w:abstractNumId w:val="5"/>
+  </w:num>
+  <w:num w:numId="8">
+    <w:abstractNumId w:val="7"/>
+  </w:num>
+  <w:num w:numId="9">
+    <w:abstractNumId w:val="6"/>
   </w:num>
 </w:numbering>
 </file>
@@ -3713,7 +4789,7 @@
   <w:style w:type="paragraph" w:default="1" w:styleId="Normal">
     <w:name w:val="Normal"/>
     <w:qFormat/>
-    <w:rsid w:val="00F15476"/>
+    <w:rsid w:val="008670DD"/>
   </w:style>
   <w:style w:type="paragraph" w:styleId="Heading1">
     <w:name w:val="heading 1"/>

</xml_diff>